<commit_message>
SN Sessional QB and QB Changes
</commit_message>
<xml_diff>
--- a/SN - Social Networks/SN_QB_Ans.docx
+++ b/SN - Social Networks/SN_QB_Ans.docx
@@ -1770,87 +1770,477 @@
                 <w:rFonts w:asciiTheme="minorHAnsi" w:hAnsiTheme="minorHAnsi" w:cstheme="minorHAnsi"/>
                 <w:sz w:val="28"/>
                 <w:szCs w:val="28"/>
-              </w:rPr>
-            </w:pPr>
-            <w:r>
-              <w:rPr>
-                <w:rFonts w:asciiTheme="minorHAnsi" w:hAnsiTheme="minorHAnsi" w:cstheme="minorHAnsi"/>
-                <w:sz w:val="28"/>
-                <w:szCs w:val="28"/>
-              </w:rPr>
-              <w:t>Social network analysis (SNA) is a research field that focuses on the study of social networks and their properties. It involves the collection, analysis, and interpretation of data from social networks to understand the relationships and interactions between individuals, groups, or organizations. SNA can be used to model real-world scenarios, such as the network of cities in India, where each city is represented as a node and the roads connecting them are represented as edges. This network can be analyzed to understand the properties of the network, such as the shortest path between two cities or the centrality of a particular city in the network.</w:t>
-            </w:r>
-          </w:p>
-          <w:p>
-            <w:pPr>
-              <w:pStyle w:val="TableParagraph"/>
-              <w:rPr>
-                <w:rFonts w:asciiTheme="minorHAnsi" w:hAnsiTheme="minorHAnsi" w:cstheme="minorHAnsi"/>
-                <w:sz w:val="28"/>
-                <w:szCs w:val="28"/>
-              </w:rPr>
-            </w:pPr>
-            <w:r>
-              <w:rPr>
-                <w:rFonts w:asciiTheme="minorHAnsi" w:hAnsiTheme="minorHAnsi" w:cstheme="minorHAnsi"/>
-                <w:sz w:val="28"/>
-                <w:szCs w:val="28"/>
-              </w:rPr>
-              <w:t>SNA can also be used to study the spread of information, ideas, and behaviors in social networks. For example, SNA can be used to analyze the spread of obesity or happiness in a social network. By analyzing the connections between individuals, SNA can help identify key individuals or groups who can influence the spread of information or behaviors.</w:t>
-            </w:r>
-          </w:p>
-          <w:p>
-            <w:pPr>
-              <w:pStyle w:val="TableParagraph"/>
-              <w:rPr>
-                <w:rFonts w:asciiTheme="minorHAnsi" w:hAnsiTheme="minorHAnsi" w:cstheme="minorHAnsi"/>
-                <w:sz w:val="28"/>
-                <w:szCs w:val="28"/>
-              </w:rPr>
-            </w:pPr>
-            <w:r>
-              <w:rPr>
-                <w:rFonts w:asciiTheme="minorHAnsi" w:hAnsiTheme="minorHAnsi" w:cstheme="minorHAnsi"/>
-                <w:sz w:val="28"/>
-                <w:szCs w:val="28"/>
-              </w:rPr>
-              <w:t>In addition, SNA can be used to study the strength of weak ties, which refers to the idea that acquaintances, rather than close friends, are often more important for getting a good job or finding new opportunities. By analyzing the connections between individuals in a social network, SNA can help identify the strength of these weak ties and their importance in social networks.</w:t>
-            </w:r>
-          </w:p>
-          <w:p>
-            <w:pPr>
-              <w:pStyle w:val="TableParagraph"/>
-              <w:rPr>
-                <w:rFonts w:asciiTheme="minorHAnsi" w:hAnsiTheme="minorHAnsi" w:cstheme="minorHAnsi"/>
-                <w:sz w:val="28"/>
-                <w:szCs w:val="28"/>
-              </w:rPr>
-            </w:pPr>
-            <w:r>
-              <w:rPr>
-                <w:rFonts w:asciiTheme="minorHAnsi" w:hAnsiTheme="minorHAnsi" w:cstheme="minorHAnsi"/>
-                <w:sz w:val="28"/>
-                <w:szCs w:val="28"/>
-              </w:rPr>
-              <w:t>Finally, SNA can be used to study marketing on social networks. By analyzing the connections between individuals in a social network, SNA can help identify the most effective ways to market a product or idea. For example, SNA can be used to identify the most influential individuals in a network or to understand how information spreads through a network.</w:t>
-            </w:r>
-          </w:p>
-          <w:p>
-            <w:pPr>
-              <w:pStyle w:val="TableParagraph"/>
-              <w:rPr>
-                <w:rFonts w:asciiTheme="minorHAnsi" w:hAnsiTheme="minorHAnsi" w:cstheme="minorHAnsi"/>
-                <w:sz w:val="28"/>
-                <w:szCs w:val="28"/>
-              </w:rPr>
-            </w:pPr>
-            <w:r>
-              <w:rPr>
-                <w:rFonts w:asciiTheme="minorHAnsi" w:hAnsiTheme="minorHAnsi" w:cstheme="minorHAnsi"/>
-                <w:sz w:val="28"/>
-                <w:szCs w:val="28"/>
-              </w:rPr>
-              <w:t>In conclusion, SNA is a powerful tool for understanding and analyzing social networks and their properties. By modeling real-world scenarios and analyzing the connections between individuals, SNA can provide valuable insights into the structure and dynamics of social networks.</w:t>
+                <w:lang w:val="en-IN"/>
+              </w:rPr>
+            </w:pPr>
+            <w:r>
+              <w:rPr>
+                <w:rFonts w:asciiTheme="minorHAnsi" w:hAnsiTheme="minorHAnsi" w:cstheme="minorHAnsi"/>
+                <w:sz w:val="28"/>
+                <w:szCs w:val="28"/>
+                <w:lang w:val="en-IN"/>
+              </w:rPr>
+              <w:t>Managing large-scale network data involves several challenges, including:</w:t>
+            </w:r>
+          </w:p>
+          <w:p>
+            <w:pPr>
+              <w:pStyle w:val="TableParagraph"/>
+              <w:numPr>
+                <w:ilvl w:val="0"/>
+                <w:numId w:val="7"/>
+              </w:numPr>
+              <w:rPr>
+                <w:rFonts w:asciiTheme="minorHAnsi" w:hAnsiTheme="minorHAnsi" w:cstheme="minorHAnsi"/>
+                <w:sz w:val="28"/>
+                <w:szCs w:val="28"/>
+                <w:lang w:val="en-IN"/>
+              </w:rPr>
+            </w:pPr>
+            <w:r>
+              <w:rPr>
+                <w:rFonts w:asciiTheme="minorHAnsi" w:hAnsiTheme="minorHAnsi" w:cstheme="minorHAnsi"/>
+                <w:b/>
+                <w:bCs/>
+                <w:sz w:val="28"/>
+                <w:szCs w:val="28"/>
+                <w:lang w:val="en-IN"/>
+              </w:rPr>
+              <w:t>Data Volume</w:t>
+            </w:r>
+            <w:r>
+              <w:rPr>
+                <w:rFonts w:asciiTheme="minorHAnsi" w:hAnsiTheme="minorHAnsi" w:cstheme="minorHAnsi"/>
+                <w:sz w:val="28"/>
+                <w:szCs w:val="28"/>
+                <w:lang w:val="en-IN"/>
+              </w:rPr>
+              <w:t>: Large-scale network data can be extremely voluminous, making it difficult to process, store, and analyze efficiently.</w:t>
+            </w:r>
+          </w:p>
+          <w:p>
+            <w:pPr>
+              <w:pStyle w:val="TableParagraph"/>
+              <w:numPr>
+                <w:ilvl w:val="0"/>
+                <w:numId w:val="7"/>
+              </w:numPr>
+              <w:rPr>
+                <w:rFonts w:asciiTheme="minorHAnsi" w:hAnsiTheme="minorHAnsi" w:cstheme="minorHAnsi"/>
+                <w:sz w:val="28"/>
+                <w:szCs w:val="28"/>
+                <w:lang w:val="en-IN"/>
+              </w:rPr>
+            </w:pPr>
+            <w:r>
+              <w:rPr>
+                <w:rFonts w:asciiTheme="minorHAnsi" w:hAnsiTheme="minorHAnsi" w:cstheme="minorHAnsi"/>
+                <w:b/>
+                <w:bCs/>
+                <w:sz w:val="28"/>
+                <w:szCs w:val="28"/>
+                <w:lang w:val="en-IN"/>
+              </w:rPr>
+              <w:t>Data Variety</w:t>
+            </w:r>
+            <w:r>
+              <w:rPr>
+                <w:rFonts w:asciiTheme="minorHAnsi" w:hAnsiTheme="minorHAnsi" w:cstheme="minorHAnsi"/>
+                <w:sz w:val="28"/>
+                <w:szCs w:val="28"/>
+                <w:lang w:val="en-IN"/>
+              </w:rPr>
+              <w:t>: Network data can come from various sources, such as social media, web graphs, and biological networks, each with its own unique characteristics and requirements.</w:t>
+            </w:r>
+          </w:p>
+          <w:p>
+            <w:pPr>
+              <w:pStyle w:val="TableParagraph"/>
+              <w:numPr>
+                <w:ilvl w:val="0"/>
+                <w:numId w:val="7"/>
+              </w:numPr>
+              <w:rPr>
+                <w:rFonts w:asciiTheme="minorHAnsi" w:hAnsiTheme="minorHAnsi" w:cstheme="minorHAnsi"/>
+                <w:sz w:val="28"/>
+                <w:szCs w:val="28"/>
+                <w:lang w:val="en-IN"/>
+              </w:rPr>
+            </w:pPr>
+            <w:r>
+              <w:rPr>
+                <w:rFonts w:asciiTheme="minorHAnsi" w:hAnsiTheme="minorHAnsi" w:cstheme="minorHAnsi"/>
+                <w:b/>
+                <w:bCs/>
+                <w:sz w:val="28"/>
+                <w:szCs w:val="28"/>
+                <w:lang w:val="en-IN"/>
+              </w:rPr>
+              <w:t>Data Velocity</w:t>
+            </w:r>
+            <w:r>
+              <w:rPr>
+                <w:rFonts w:asciiTheme="minorHAnsi" w:hAnsiTheme="minorHAnsi" w:cstheme="minorHAnsi"/>
+                <w:sz w:val="28"/>
+                <w:szCs w:val="28"/>
+                <w:lang w:val="en-IN"/>
+              </w:rPr>
+              <w:t>: Network data can change rapidly, requiring real-time or near-real-time processing and analysis.</w:t>
+            </w:r>
+          </w:p>
+          <w:p>
+            <w:pPr>
+              <w:pStyle w:val="TableParagraph"/>
+              <w:numPr>
+                <w:ilvl w:val="0"/>
+                <w:numId w:val="7"/>
+              </w:numPr>
+              <w:rPr>
+                <w:rFonts w:asciiTheme="minorHAnsi" w:hAnsiTheme="minorHAnsi" w:cstheme="minorHAnsi"/>
+                <w:sz w:val="28"/>
+                <w:szCs w:val="28"/>
+                <w:lang w:val="en-IN"/>
+              </w:rPr>
+            </w:pPr>
+            <w:r>
+              <w:rPr>
+                <w:rFonts w:asciiTheme="minorHAnsi" w:hAnsiTheme="minorHAnsi" w:cstheme="minorHAnsi"/>
+                <w:b/>
+                <w:bCs/>
+                <w:sz w:val="28"/>
+                <w:szCs w:val="28"/>
+                <w:lang w:val="en-IN"/>
+              </w:rPr>
+              <w:t>Data Veracity</w:t>
+            </w:r>
+            <w:r>
+              <w:rPr>
+                <w:rFonts w:asciiTheme="minorHAnsi" w:hAnsiTheme="minorHAnsi" w:cstheme="minorHAnsi"/>
+                <w:sz w:val="28"/>
+                <w:szCs w:val="28"/>
+                <w:lang w:val="en-IN"/>
+              </w:rPr>
+              <w:t>: Ensuring the accuracy and reliability of network data is crucial for meaningful analysis and decision-making.</w:t>
+            </w:r>
+          </w:p>
+          <w:p>
+            <w:pPr>
+              <w:pStyle w:val="TableParagraph"/>
+              <w:rPr>
+                <w:rFonts w:asciiTheme="minorHAnsi" w:hAnsiTheme="minorHAnsi" w:cstheme="minorHAnsi"/>
+                <w:sz w:val="28"/>
+                <w:szCs w:val="28"/>
+                <w:lang w:val="en-IN"/>
+              </w:rPr>
+            </w:pPr>
+            <w:r>
+              <w:rPr>
+                <w:rFonts w:asciiTheme="minorHAnsi" w:hAnsiTheme="minorHAnsi" w:cstheme="minorHAnsi"/>
+                <w:sz w:val="28"/>
+                <w:szCs w:val="28"/>
+                <w:lang w:val="en-IN"/>
+              </w:rPr>
+              <w:t>To address these challenges, several techniques are used:</w:t>
+            </w:r>
+          </w:p>
+          <w:p>
+            <w:pPr>
+              <w:pStyle w:val="TableParagraph"/>
+              <w:numPr>
+                <w:ilvl w:val="0"/>
+                <w:numId w:val="8"/>
+              </w:numPr>
+              <w:rPr>
+                <w:rFonts w:asciiTheme="minorHAnsi" w:hAnsiTheme="minorHAnsi" w:cstheme="minorHAnsi"/>
+                <w:sz w:val="28"/>
+                <w:szCs w:val="28"/>
+                <w:lang w:val="en-IN"/>
+              </w:rPr>
+            </w:pPr>
+            <w:r>
+              <w:rPr>
+                <w:rFonts w:asciiTheme="minorHAnsi" w:hAnsiTheme="minorHAnsi" w:cstheme="minorHAnsi"/>
+                <w:b/>
+                <w:bCs/>
+                <w:sz w:val="28"/>
+                <w:szCs w:val="28"/>
+                <w:lang w:val="en-IN"/>
+              </w:rPr>
+              <w:t>Data Sampling</w:t>
+            </w:r>
+            <w:r>
+              <w:rPr>
+                <w:rFonts w:asciiTheme="minorHAnsi" w:hAnsiTheme="minorHAnsi" w:cstheme="minorHAnsi"/>
+                <w:sz w:val="28"/>
+                <w:szCs w:val="28"/>
+                <w:lang w:val="en-IN"/>
+              </w:rPr>
+              <w:t>: Selecting a representative subset of the data for analysis, reducing the volume and complexity of the data.</w:t>
+            </w:r>
+          </w:p>
+          <w:p>
+            <w:pPr>
+              <w:pStyle w:val="TableParagraph"/>
+              <w:numPr>
+                <w:ilvl w:val="0"/>
+                <w:numId w:val="8"/>
+              </w:numPr>
+              <w:rPr>
+                <w:rFonts w:asciiTheme="minorHAnsi" w:hAnsiTheme="minorHAnsi" w:cstheme="minorHAnsi"/>
+                <w:sz w:val="28"/>
+                <w:szCs w:val="28"/>
+                <w:lang w:val="en-IN"/>
+              </w:rPr>
+            </w:pPr>
+            <w:r>
+              <w:rPr>
+                <w:rFonts w:asciiTheme="minorHAnsi" w:hAnsiTheme="minorHAnsi" w:cstheme="minorHAnsi"/>
+                <w:b/>
+                <w:bCs/>
+                <w:sz w:val="28"/>
+                <w:szCs w:val="28"/>
+                <w:lang w:val="en-IN"/>
+              </w:rPr>
+              <w:t>Data Aggregation</w:t>
+            </w:r>
+            <w:r>
+              <w:rPr>
+                <w:rFonts w:asciiTheme="minorHAnsi" w:hAnsiTheme="minorHAnsi" w:cstheme="minorHAnsi"/>
+                <w:sz w:val="28"/>
+                <w:szCs w:val="28"/>
+                <w:lang w:val="en-IN"/>
+              </w:rPr>
+              <w:t>: Combining data from multiple sources or time periods to simplify analysis and reduce data volume.</w:t>
+            </w:r>
+          </w:p>
+          <w:p>
+            <w:pPr>
+              <w:pStyle w:val="TableParagraph"/>
+              <w:numPr>
+                <w:ilvl w:val="0"/>
+                <w:numId w:val="8"/>
+              </w:numPr>
+              <w:rPr>
+                <w:rFonts w:asciiTheme="minorHAnsi" w:hAnsiTheme="minorHAnsi" w:cstheme="minorHAnsi"/>
+                <w:sz w:val="28"/>
+                <w:szCs w:val="28"/>
+                <w:lang w:val="en-IN"/>
+              </w:rPr>
+            </w:pPr>
+            <w:r>
+              <w:rPr>
+                <w:rFonts w:asciiTheme="minorHAnsi" w:hAnsiTheme="minorHAnsi" w:cstheme="minorHAnsi"/>
+                <w:b/>
+                <w:bCs/>
+                <w:sz w:val="28"/>
+                <w:szCs w:val="28"/>
+                <w:lang w:val="en-IN"/>
+              </w:rPr>
+              <w:t>Data Compression</w:t>
+            </w:r>
+            <w:r>
+              <w:rPr>
+                <w:rFonts w:asciiTheme="minorHAnsi" w:hAnsiTheme="minorHAnsi" w:cstheme="minorHAnsi"/>
+                <w:sz w:val="28"/>
+                <w:szCs w:val="28"/>
+                <w:lang w:val="en-IN"/>
+              </w:rPr>
+              <w:t>: Reducing the size of the data without losing important information, allowing for more efficient storage and processing.</w:t>
+            </w:r>
+          </w:p>
+          <w:p>
+            <w:pPr>
+              <w:pStyle w:val="TableParagraph"/>
+              <w:numPr>
+                <w:ilvl w:val="0"/>
+                <w:numId w:val="8"/>
+              </w:numPr>
+              <w:rPr>
+                <w:rFonts w:asciiTheme="minorHAnsi" w:hAnsiTheme="minorHAnsi" w:cstheme="minorHAnsi"/>
+                <w:sz w:val="28"/>
+                <w:szCs w:val="28"/>
+                <w:lang w:val="en-IN"/>
+              </w:rPr>
+            </w:pPr>
+            <w:r>
+              <w:rPr>
+                <w:rFonts w:asciiTheme="minorHAnsi" w:hAnsiTheme="minorHAnsi" w:cstheme="minorHAnsi"/>
+                <w:b/>
+                <w:bCs/>
+                <w:sz w:val="28"/>
+                <w:szCs w:val="28"/>
+                <w:lang w:val="en-IN"/>
+              </w:rPr>
+              <w:t>Data Integration</w:t>
+            </w:r>
+            <w:r>
+              <w:rPr>
+                <w:rFonts w:asciiTheme="minorHAnsi" w:hAnsiTheme="minorHAnsi" w:cstheme="minorHAnsi"/>
+                <w:sz w:val="28"/>
+                <w:szCs w:val="28"/>
+                <w:lang w:val="en-IN"/>
+              </w:rPr>
+              <w:t>: Combining data from different sources and formats into a unified format, enabling more comprehensive analysis.</w:t>
+            </w:r>
+          </w:p>
+          <w:p>
+            <w:pPr>
+              <w:pStyle w:val="TableParagraph"/>
+              <w:numPr>
+                <w:ilvl w:val="0"/>
+                <w:numId w:val="8"/>
+              </w:numPr>
+              <w:rPr>
+                <w:rFonts w:asciiTheme="minorHAnsi" w:hAnsiTheme="minorHAnsi" w:cstheme="minorHAnsi"/>
+                <w:sz w:val="28"/>
+                <w:szCs w:val="28"/>
+                <w:lang w:val="en-IN"/>
+              </w:rPr>
+            </w:pPr>
+            <w:r>
+              <w:rPr>
+                <w:rFonts w:asciiTheme="minorHAnsi" w:hAnsiTheme="minorHAnsi" w:cstheme="minorHAnsi"/>
+                <w:b/>
+                <w:bCs/>
+                <w:sz w:val="28"/>
+                <w:szCs w:val="28"/>
+                <w:lang w:val="en-IN"/>
+              </w:rPr>
+              <w:t>Data Visualization</w:t>
+            </w:r>
+            <w:r>
+              <w:rPr>
+                <w:rFonts w:asciiTheme="minorHAnsi" w:hAnsiTheme="minorHAnsi" w:cstheme="minorHAnsi"/>
+                <w:sz w:val="28"/>
+                <w:szCs w:val="28"/>
+                <w:lang w:val="en-IN"/>
+              </w:rPr>
+              <w:t>: Representing network data in a visual format, such as graphs or maps, to facilitate understanding and analysis.</w:t>
+            </w:r>
+          </w:p>
+          <w:p>
+            <w:pPr>
+              <w:pStyle w:val="TableParagraph"/>
+              <w:numPr>
+                <w:ilvl w:val="0"/>
+                <w:numId w:val="8"/>
+              </w:numPr>
+              <w:rPr>
+                <w:rFonts w:asciiTheme="minorHAnsi" w:hAnsiTheme="minorHAnsi" w:cstheme="minorHAnsi"/>
+                <w:sz w:val="28"/>
+                <w:szCs w:val="28"/>
+                <w:lang w:val="en-IN"/>
+              </w:rPr>
+            </w:pPr>
+            <w:r>
+              <w:rPr>
+                <w:rFonts w:asciiTheme="minorHAnsi" w:hAnsiTheme="minorHAnsi" w:cstheme="minorHAnsi"/>
+                <w:b/>
+                <w:bCs/>
+                <w:sz w:val="28"/>
+                <w:szCs w:val="28"/>
+                <w:lang w:val="en-IN"/>
+              </w:rPr>
+              <w:t>Data Analytics</w:t>
+            </w:r>
+            <w:r>
+              <w:rPr>
+                <w:rFonts w:asciiTheme="minorHAnsi" w:hAnsiTheme="minorHAnsi" w:cstheme="minorHAnsi"/>
+                <w:sz w:val="28"/>
+                <w:szCs w:val="28"/>
+                <w:lang w:val="en-IN"/>
+              </w:rPr>
+              <w:t>: Applying advanced analytical techniques, such as machine learning and network analysis, to extract insights and patterns from the data.</w:t>
+            </w:r>
+          </w:p>
+          <w:p>
+            <w:pPr>
+              <w:pStyle w:val="TableParagraph"/>
+              <w:numPr>
+                <w:ilvl w:val="0"/>
+                <w:numId w:val="8"/>
+              </w:numPr>
+              <w:rPr>
+                <w:rFonts w:asciiTheme="minorHAnsi" w:hAnsiTheme="minorHAnsi" w:cstheme="minorHAnsi"/>
+                <w:sz w:val="28"/>
+                <w:szCs w:val="28"/>
+                <w:lang w:val="en-IN"/>
+              </w:rPr>
+            </w:pPr>
+            <w:r>
+              <w:rPr>
+                <w:rFonts w:asciiTheme="minorHAnsi" w:hAnsiTheme="minorHAnsi" w:cstheme="minorHAnsi"/>
+                <w:b/>
+                <w:bCs/>
+                <w:sz w:val="28"/>
+                <w:szCs w:val="28"/>
+                <w:lang w:val="en-IN"/>
+              </w:rPr>
+              <w:t>Data Security</w:t>
+            </w:r>
+            <w:r>
+              <w:rPr>
+                <w:rFonts w:asciiTheme="minorHAnsi" w:hAnsiTheme="minorHAnsi" w:cstheme="minorHAnsi"/>
+                <w:sz w:val="28"/>
+                <w:szCs w:val="28"/>
+                <w:lang w:val="en-IN"/>
+              </w:rPr>
+              <w:t>: Ensuring the confidentiality, integrity, and availability of network data, particularly in the context of sensitive information.</w:t>
+            </w:r>
+          </w:p>
+          <w:p>
+            <w:pPr>
+              <w:pStyle w:val="TableParagraph"/>
+              <w:numPr>
+                <w:ilvl w:val="0"/>
+                <w:numId w:val="8"/>
+              </w:numPr>
+              <w:rPr>
+                <w:rFonts w:asciiTheme="minorHAnsi" w:hAnsiTheme="minorHAnsi" w:cstheme="minorHAnsi"/>
+                <w:sz w:val="28"/>
+                <w:szCs w:val="28"/>
+                <w:lang w:val="en-IN"/>
+              </w:rPr>
+            </w:pPr>
+            <w:r>
+              <w:rPr>
+                <w:rFonts w:asciiTheme="minorHAnsi" w:hAnsiTheme="minorHAnsi" w:cstheme="minorHAnsi"/>
+                <w:b/>
+                <w:bCs/>
+                <w:sz w:val="28"/>
+                <w:szCs w:val="28"/>
+                <w:lang w:val="en-IN"/>
+              </w:rPr>
+              <w:t>Data Governance</w:t>
+            </w:r>
+            <w:r>
+              <w:rPr>
+                <w:rFonts w:asciiTheme="minorHAnsi" w:hAnsiTheme="minorHAnsi" w:cstheme="minorHAnsi"/>
+                <w:sz w:val="28"/>
+                <w:szCs w:val="28"/>
+                <w:lang w:val="en-IN"/>
+              </w:rPr>
+              <w:t>: Establishing policies and procedures for managing network data, including data access, sharing, and retention.</w:t>
+            </w:r>
+          </w:p>
+          <w:p>
+            <w:pPr>
+              <w:pStyle w:val="TableParagraph"/>
+              <w:ind w:left="0"/>
+              <w:rPr>
+                <w:rFonts w:asciiTheme="minorHAnsi" w:hAnsiTheme="minorHAnsi" w:cstheme="minorHAnsi"/>
+                <w:sz w:val="28"/>
+                <w:szCs w:val="28"/>
+              </w:rPr>
+            </w:pPr>
+            <w:r>
+              <w:rPr>
+                <w:rFonts w:asciiTheme="minorHAnsi" w:hAnsiTheme="minorHAnsi" w:cstheme="minorHAnsi"/>
+                <w:sz w:val="28"/>
+                <w:szCs w:val="28"/>
+                <w:lang w:val="en-IN"/>
+              </w:rPr>
+              <w:t>By employing these techniques, organizations can effectively manage large-scale network data, enabling them to gain valuable insights and make informed decisions based on the data.</w:t>
             </w:r>
           </w:p>
         </w:tc>
@@ -1860,8 +2250,7 @@
       <w:pPr>
         <w:pStyle w:val="TableParagraph"/>
         <w:spacing w:before="69"/>
-        <w:ind w:left="1"/>
-        <w:jc w:val="center"/>
+        <w:ind w:left="0"/>
         <w:rPr>
           <w:rFonts w:asciiTheme="minorHAnsi" w:hAnsiTheme="minorHAnsi" w:cstheme="minorHAnsi"/>
           <w:b/>
@@ -1870,7 +2259,7 @@
           <w:szCs w:val="28"/>
         </w:rPr>
         <w:sectPr>
-          <w:pgSz w:w="11913" w:h="10490"/>
+          <w:pgSz w:w="11913" w:h="12191"/>
           <w:pgMar w:top="142" w:right="573" w:bottom="278" w:left="697" w:header="720" w:footer="720" w:gutter="0"/>
           <w:cols w:space="720"/>
         </w:sectPr>
@@ -3959,25 +4348,7 @@
                 <w:sz w:val="28"/>
                 <w:szCs w:val="28"/>
               </w:rPr>
-              <w:t xml:space="preserve">There are several ways in which marketers can leverage social networks for marketing purposes. One approach is to create branded content, such as videos, infographics, or blog posts, and share them on social media platforms. This can help to increase brand awareness and engagement, as well as to drive traffic to </w:t>
-            </w:r>
-            <w:proofErr w:type="gramStart"/>
-            <w:r>
-              <w:rPr>
-                <w:rFonts w:asciiTheme="minorHAnsi" w:hAnsiTheme="minorHAnsi" w:cstheme="minorHAnsi"/>
-                <w:sz w:val="28"/>
-                <w:szCs w:val="28"/>
-              </w:rPr>
-              <w:t>a company's</w:t>
-            </w:r>
-            <w:proofErr w:type="gramEnd"/>
-            <w:r>
-              <w:rPr>
-                <w:rFonts w:asciiTheme="minorHAnsi" w:hAnsiTheme="minorHAnsi" w:cstheme="minorHAnsi"/>
-                <w:sz w:val="28"/>
-                <w:szCs w:val="28"/>
-              </w:rPr>
-              <w:t xml:space="preserve"> website.</w:t>
+              <w:t>There are several ways in which marketers can leverage social networks for marketing purposes. One approach is to create branded content, such as videos, infographics, or blog posts, and share them on social media platforms. This can help to increase brand awareness and engagement, as well as to drive traffic to a company's website.</w:t>
             </w:r>
           </w:p>
           <w:p>
@@ -7786,23 +8157,7 @@
                 <w:sz w:val="28"/>
                 <w:szCs w:val="28"/>
               </w:rPr>
-              <w:t xml:space="preserve">The algorithm has several advantages over other community detection algorithms, including its ability to identify overlapping communities, where nodes can belong to multiple communities, and its ability to handle weighted networks, where edges have associated weights that reflect their importance. However, the algorithm can be computationally expensive for large networks, and its performance can be sensitive to the choice of betweenness centrality </w:t>
-            </w:r>
-            <w:proofErr w:type="gramStart"/>
-            <w:r>
-              <w:rPr>
-                <w:sz w:val="28"/>
-                <w:szCs w:val="28"/>
-              </w:rPr>
-              <w:t>measure</w:t>
-            </w:r>
-            <w:proofErr w:type="gramEnd"/>
-            <w:r>
-              <w:rPr>
-                <w:sz w:val="28"/>
-                <w:szCs w:val="28"/>
-              </w:rPr>
-              <w:t xml:space="preserve"> and the threshold used to remove edges.</w:t>
+              <w:t>The algorithm has several advantages over other community detection algorithms, including its ability to identify overlapping communities, where nodes can belong to multiple communities, and its ability to handle weighted networks, where edges have associated weights that reflect their importance. However, the algorithm can be computationally expensive for large networks, and its performance can be sensitive to the choice of betweenness centrality measure and the threshold used to remove edges.</w:t>
             </w:r>
           </w:p>
           <w:p>
@@ -9565,7 +9920,6 @@
               </w:rPr>
               <w:t xml:space="preserve"> </w:t>
             </w:r>
-            <w:proofErr w:type="gramStart"/>
             <w:r>
               <w:rPr>
                 <w:b/>
@@ -9575,7 +9929,6 @@
               </w:rPr>
               <w:t>the</w:t>
             </w:r>
-            <w:proofErr w:type="gramEnd"/>
             <w:r>
               <w:rPr>
                 <w:b/>
@@ -9814,23 +10167,7 @@
                 <w:sz w:val="28"/>
                 <w:szCs w:val="28"/>
               </w:rPr>
-              <w:t>Power laws are a type of distribution that is often observed in social networks, where a few nodes have a very high degree (number of connections</w:t>
-            </w:r>
-            <w:proofErr w:type="gramStart"/>
-            <w:r>
-              <w:rPr>
-                <w:sz w:val="28"/>
-                <w:szCs w:val="28"/>
-              </w:rPr>
-              <w:t>)</w:t>
-            </w:r>
-            <w:proofErr w:type="gramEnd"/>
-            <w:r>
-              <w:rPr>
-                <w:sz w:val="28"/>
-                <w:szCs w:val="28"/>
-              </w:rPr>
-              <w:t xml:space="preserve"> and many nodes have a low degree. This is also known as the "rich-get-richer" phenomenon, where nodes with a high degree are more likely to attract new connections.</w:t>
+              <w:t>Power laws are a type of distribution that is often observed in social networks, where a few nodes have a very high degree (number of connections) and many nodes have a low degree. This is also known as the "rich-get-richer" phenomenon, where nodes with a high degree are more likely to attract new connections.</w:t>
             </w:r>
           </w:p>
           <w:p>
@@ -11507,23 +11844,7 @@
                 <w:sz w:val="28"/>
                 <w:szCs w:val="28"/>
               </w:rPr>
-              <w:t xml:space="preserve"> After adding a new person, connections are established between </w:t>
-            </w:r>
-            <w:proofErr w:type="gramStart"/>
-            <w:r>
-              <w:rPr>
-                <w:sz w:val="28"/>
-                <w:szCs w:val="28"/>
-              </w:rPr>
-              <w:t>this individual and existing nodes</w:t>
-            </w:r>
-            <w:proofErr w:type="gramEnd"/>
-            <w:r>
-              <w:rPr>
-                <w:sz w:val="28"/>
-                <w:szCs w:val="28"/>
-              </w:rPr>
-              <w:t xml:space="preserve"> in the network. The connections are formed based on the principles of homophily, where individuals with similar attributes are more likely to connect.</w:t>
+              <w:t xml:space="preserve"> After adding a new person, connections are established between this individual and existing nodes in the network. The connections are formed based on the principles of homophily, where individuals with similar attributes are more likely to connect.</w:t>
             </w:r>
           </w:p>
           <w:p>
@@ -12327,7 +12648,16 @@
                 <w:sz w:val="28"/>
                 <w:szCs w:val="28"/>
               </w:rPr>
-              <w:t>elobrate</w:t>
+              <w:t>E</w:t>
+            </w:r>
+            <w:r>
+              <w:rPr>
+                <w:b/>
+                <w:bCs/>
+                <w:sz w:val="28"/>
+                <w:szCs w:val="28"/>
+              </w:rPr>
+              <w:t>lobrate</w:t>
             </w:r>
             <w:proofErr w:type="spellEnd"/>
             <w:r>
@@ -12976,23 +13306,7 @@
                 <w:sz w:val="28"/>
                 <w:szCs w:val="28"/>
               </w:rPr>
-              <w:t xml:space="preserve">To understand the impact of spatial segregation on social networks, researchers often use techniques such as network analysis, spatial analysis, and geographic information systems (GIS) to analyze the structure and dynamics of social networks in different geographic areas. By combining these techniques, researchers can identify patterns of spatial segregation and their impact on social </w:t>
-            </w:r>
-            <w:proofErr w:type="gramStart"/>
-            <w:r>
-              <w:rPr>
-                <w:sz w:val="28"/>
-                <w:szCs w:val="28"/>
-              </w:rPr>
-              <w:t>networks, and</w:t>
-            </w:r>
-            <w:proofErr w:type="gramEnd"/>
-            <w:r>
-              <w:rPr>
-                <w:sz w:val="28"/>
-                <w:szCs w:val="28"/>
-              </w:rPr>
-              <w:t xml:space="preserve"> develop strategies to promote social integration and reduce spatial segregation.</w:t>
+              <w:t>To understand the impact of spatial segregation on social networks, researchers often use techniques such as network analysis, spatial analysis, and geographic information systems (GIS) to analyze the structure and dynamics of social networks in different geographic areas. By combining these techniques, researchers can identify patterns of spatial segregation and their impact on social networks, and develop strategies to promote social integration and reduce spatial segregation.</w:t>
             </w:r>
           </w:p>
           <w:p>
@@ -13290,23 +13604,7 @@
                 <w:sz w:val="28"/>
                 <w:szCs w:val="28"/>
               </w:rPr>
-              <w:t xml:space="preserve">The basic idea of the Schelling Model is to simulate the behavior of a group of agents who </w:t>
-            </w:r>
-            <w:proofErr w:type="gramStart"/>
-            <w:r>
-              <w:rPr>
-                <w:sz w:val="28"/>
-                <w:szCs w:val="28"/>
-              </w:rPr>
-              <w:t>have a preference for</w:t>
-            </w:r>
-            <w:proofErr w:type="gramEnd"/>
-            <w:r>
-              <w:rPr>
-                <w:sz w:val="28"/>
-                <w:szCs w:val="28"/>
-              </w:rPr>
-              <w:t xml:space="preserve"> living near other agents who are similar to them. Each agent is represented as a point on a grid, and the grid represents a two-dimensional space. The agents have a tolerance level, which determines the minimum fraction of similar agents they need to be satisfied. If an agent is not satisfied, it moves to a random location on the grid where it is more likely to find a higher concentration of similar agents.</w:t>
+              <w:t>The basic idea of the Schelling Model is to simulate the behavior of a group of agents who have a preference for living near other agents who are similar to them. Each agent is represented as a point on a grid, and the grid represents a two-dimensional space. The agents have a tolerance level, which determines the minimum fraction of similar agents they need to be satisfied. If an agent is not satisfied, it moves to a random location on the grid where it is more likely to find a higher concentration of similar agents.</w:t>
             </w:r>
           </w:p>
           <w:p>
@@ -13824,23 +14122,7 @@
                 <w:sz w:val="28"/>
                 <w:szCs w:val="28"/>
               </w:rPr>
-              <w:t xml:space="preserve">The concept of "enemy's enemy is a friend" is a principle in social network analysis that suggests that individuals or groups with shared enemies or adversaries can form alliances or relationships based on their common interests. This principle is often observed in situations where individuals or groups have a common goal or </w:t>
-            </w:r>
-            <w:proofErr w:type="gramStart"/>
-            <w:r>
-              <w:rPr>
-                <w:sz w:val="28"/>
-                <w:szCs w:val="28"/>
-              </w:rPr>
-              <w:t>objective, but</w:t>
-            </w:r>
-            <w:proofErr w:type="gramEnd"/>
-            <w:r>
-              <w:rPr>
-                <w:sz w:val="28"/>
-                <w:szCs w:val="28"/>
-              </w:rPr>
-              <w:t xml:space="preserve"> may have different perspectives or approaches to achieving that goal.</w:t>
+              <w:t>The concept of "enemy's enemy is a friend" is a principle in social network analysis that suggests that individuals or groups with shared enemies or adversaries can form alliances or relationships based on their common interests. This principle is often observed in situations where individuals or groups have a common goal or objective, but may have different perspectives or approaches to achieving that goal.</w:t>
             </w:r>
           </w:p>
           <w:p>
@@ -13941,23 +14223,7 @@
                 <w:sz w:val="28"/>
                 <w:szCs w:val="28"/>
               </w:rPr>
-              <w:t xml:space="preserve">Overall, the principle of "enemy's enemy is a friend" is a fundamental concept in social network analysis that highlights the complex and dynamic nature of social relationships and interactions. By understanding the principles and mechanisms that govern these relationships, researchers can gain insights into the structure and behavior of social </w:t>
-            </w:r>
-            <w:proofErr w:type="gramStart"/>
-            <w:r>
-              <w:rPr>
-                <w:sz w:val="28"/>
-                <w:szCs w:val="28"/>
-              </w:rPr>
-              <w:t>networks, and</w:t>
-            </w:r>
-            <w:proofErr w:type="gramEnd"/>
-            <w:r>
-              <w:rPr>
-                <w:sz w:val="28"/>
-                <w:szCs w:val="28"/>
-              </w:rPr>
-              <w:t xml:space="preserve"> develop strategies to promote positive social outcomes.</w:t>
+              <w:t>Overall, the principle of "enemy's enemy is a friend" is a fundamental concept in social network analysis that highlights the complex and dynamic nature of social relationships and interactions. By understanding the principles and mechanisms that govern these relationships, researchers can gain insights into the structure and behavior of social networks, and develop strategies to promote positive social outcomes.</w:t>
             </w:r>
           </w:p>
         </w:tc>
@@ -14620,23 +14886,7 @@
                 <w:sz w:val="28"/>
                 <w:szCs w:val="28"/>
               </w:rPr>
-              <w:t xml:space="preserve">The "equal coin distribution" is an example of how probability theory can be used to explain seemingly unlikely events in social networks. By understanding the underlying probabilities, researchers can gain insights into the structure and behavior of social </w:t>
-            </w:r>
-            <w:proofErr w:type="gramStart"/>
-            <w:r>
-              <w:rPr>
-                <w:sz w:val="28"/>
-                <w:szCs w:val="28"/>
-              </w:rPr>
-              <w:t>networks, and</w:t>
-            </w:r>
-            <w:proofErr w:type="gramEnd"/>
-            <w:r>
-              <w:rPr>
-                <w:sz w:val="28"/>
-                <w:szCs w:val="28"/>
-              </w:rPr>
-              <w:t xml:space="preserve"> develop strategies to promote positive social outcomes.</w:t>
+              <w:t>The "equal coin distribution" is an example of how probability theory can be used to explain seemingly unlikely events in social networks. By understanding the underlying probabilities, researchers can gain insights into the structure and behavior of social networks, and develop strategies to promote positive social outcomes.</w:t>
             </w:r>
           </w:p>
         </w:tc>
@@ -15595,23 +15845,7 @@
                 <w:sz w:val="28"/>
                 <w:szCs w:val="28"/>
               </w:rPr>
-              <w:t xml:space="preserve">In summary, communities can have a significant impact on diffusion in social networks. They can provide a dense and interconnected group of individuals who are more likely to share and spread information within the </w:t>
-            </w:r>
-            <w:proofErr w:type="gramStart"/>
-            <w:r>
-              <w:rPr>
-                <w:sz w:val="28"/>
-                <w:szCs w:val="28"/>
-              </w:rPr>
-              <w:t>community, and</w:t>
-            </w:r>
-            <w:proofErr w:type="gramEnd"/>
-            <w:r>
-              <w:rPr>
-                <w:sz w:val="28"/>
-                <w:szCs w:val="28"/>
-              </w:rPr>
-              <w:t xml:space="preserve"> can also facilitate the spread of information and ideas between different communities. Understanding the impact of communities on diffusion is crucial for understanding the dynamics of social networks and for developing strategies to promote positive diffusion outcomes.</w:t>
+              <w:t>In summary, communities can have a significant impact on diffusion in social networks. They can provide a dense and interconnected group of individuals who are more likely to share and spread information within the community, and can also facilitate the spread of information and ideas between different communities. Understanding the impact of communities on diffusion is crucial for understanding the dynamics of social networks and for developing strategies to promote positive diffusion outcomes.</w:t>
             </w:r>
           </w:p>
         </w:tc>
@@ -17062,23 +17296,7 @@
                 <w:sz w:val="28"/>
                 <w:szCs w:val="28"/>
               </w:rPr>
-              <w:t xml:space="preserve">Foci closure refers to the process of forming ties based on shared social foci, such as shared activities, interests, or experiences. When individuals share a </w:t>
-            </w:r>
-            <w:proofErr w:type="gramStart"/>
-            <w:r>
-              <w:rPr>
-                <w:sz w:val="28"/>
-                <w:szCs w:val="28"/>
-              </w:rPr>
-              <w:t>social foci</w:t>
-            </w:r>
-            <w:proofErr w:type="gramEnd"/>
-            <w:r>
-              <w:rPr>
-                <w:sz w:val="28"/>
-                <w:szCs w:val="28"/>
-              </w:rPr>
-              <w:t>, they are more likely to form ties with each other, leading to the formation of clustered structures in the network. Foci closure is an important mechanism for the formation of cohesive subgroups within a larger network.</w:t>
+              <w:t>Foci closure refers to the process of forming ties based on shared social foci, such as shared activities, interests, or experiences. When individuals share a social foci, they are more likely to form ties with each other, leading to the formation of clustered structures in the network. Foci closure is an important mechanism for the formation of cohesive subgroups within a larger network.</w:t>
             </w:r>
           </w:p>
           <w:p>
@@ -17790,23 +18008,7 @@
                 <w:sz w:val="28"/>
                 <w:szCs w:val="28"/>
               </w:rPr>
-              <w:t xml:space="preserve">To illustrate this point, consider the example of the words "love" and "hate" in English. Although these words are not synonyms in the strict sense, it is possible to traverse a synonymy network from "love" to "hate" by following a series of synonymous relationships. For example, "love" might be synonymous with "affection," which might be synonymous with "liking," which might be synonymous with "dislike," which might be synonymous with "hatred," which might be synonymous with "hate." This example demonstrates the surprising and sometimes counterintuitive nature of synonymy </w:t>
-            </w:r>
-            <w:proofErr w:type="gramStart"/>
-            <w:r>
-              <w:rPr>
-                <w:sz w:val="28"/>
-                <w:szCs w:val="28"/>
-              </w:rPr>
-              <w:t>networks, and</w:t>
-            </w:r>
-            <w:proofErr w:type="gramEnd"/>
-            <w:r>
-              <w:rPr>
-                <w:sz w:val="28"/>
-                <w:szCs w:val="28"/>
-              </w:rPr>
-              <w:t xml:space="preserve"> highlights the value of network analysis in understanding the structure of natural language.</w:t>
+              <w:t>To illustrate this point, consider the example of the words "love" and "hate" in English. Although these words are not synonyms in the strict sense, it is possible to traverse a synonymy network from "love" to "hate" by following a series of synonymous relationships. For example, "love" might be synonymous with "affection," which might be synonymous with "liking," which might be synonymous with "dislike," which might be synonymous with "hatred," which might be synonymous with "hate." This example demonstrates the surprising and sometimes counterintuitive nature of synonymy networks, and highlights the value of network analysis in understanding the structure of natural language.</w:t>
             </w:r>
           </w:p>
           <w:p>
@@ -18143,23 +18345,7 @@
                 <w:sz w:val="28"/>
                 <w:szCs w:val="28"/>
               </w:rPr>
-              <w:t xml:space="preserve">To illustrate this point, consider the example of the words "love" and "hate" in English. Although these words are not synonyms in the strict sense, it is possible to traverse a synonymy network from "love" to "hate" by following a series of synonymous relationships. For example, "love" might be synonymous with "affection," which might be synonymous with "liking," which might be synonymous with "dislike," which might be synonymous with "hatred," which might be synonymous with "hate." This example demonstrates the surprising and sometimes counterintuitive nature of synonymy </w:t>
-            </w:r>
-            <w:proofErr w:type="gramStart"/>
-            <w:r>
-              <w:rPr>
-                <w:sz w:val="28"/>
-                <w:szCs w:val="28"/>
-              </w:rPr>
-              <w:t>networks, and</w:t>
-            </w:r>
-            <w:proofErr w:type="gramEnd"/>
-            <w:r>
-              <w:rPr>
-                <w:sz w:val="28"/>
-                <w:szCs w:val="28"/>
-              </w:rPr>
-              <w:t xml:space="preserve"> highlights the value of network analysis in understanding the structure of natural language.</w:t>
+              <w:t>To illustrate this point, consider the example of the words "love" and "hate" in English. Although these words are not synonyms in the strict sense, it is possible to traverse a synonymy network from "love" to "hate" by following a series of synonymous relationships. For example, "love" might be synonymous with "affection," which might be synonymous with "liking," which might be synonymous with "dislike," which might be synonymous with "hatred," which might be synonymous with "hate." This example demonstrates the surprising and sometimes counterintuitive nature of synonymy networks, and highlights the value of network analysis in understanding the structure of natural language.</w:t>
             </w:r>
           </w:p>
           <w:p>
@@ -18318,6 +18504,119 @@
     </w:lvl>
   </w:abstractNum>
   <w:abstractNum w:abstractNumId="1" w15:restartNumberingAfterBreak="0">
+    <w:nsid w:val="3ADF3B9C"/>
+    <w:multiLevelType w:val="multilevel"/>
+    <w:tmpl w:val="384E87D0"/>
+    <w:lvl w:ilvl="0">
+      <w:start w:val="1"/>
+      <w:numFmt w:val="decimal"/>
+      <w:lvlText w:val="%1."/>
+      <w:lvlJc w:val="left"/>
+      <w:pPr>
+        <w:tabs>
+          <w:tab w:val="num" w:pos="720"/>
+        </w:tabs>
+        <w:ind w:left="720" w:hanging="360"/>
+      </w:pPr>
+    </w:lvl>
+    <w:lvl w:ilvl="1" w:tentative="1">
+      <w:start w:val="1"/>
+      <w:numFmt w:val="decimal"/>
+      <w:lvlText w:val="%2."/>
+      <w:lvlJc w:val="left"/>
+      <w:pPr>
+        <w:tabs>
+          <w:tab w:val="num" w:pos="1440"/>
+        </w:tabs>
+        <w:ind w:left="1440" w:hanging="360"/>
+      </w:pPr>
+    </w:lvl>
+    <w:lvl w:ilvl="2" w:tentative="1">
+      <w:start w:val="1"/>
+      <w:numFmt w:val="decimal"/>
+      <w:lvlText w:val="%3."/>
+      <w:lvlJc w:val="left"/>
+      <w:pPr>
+        <w:tabs>
+          <w:tab w:val="num" w:pos="2160"/>
+        </w:tabs>
+        <w:ind w:left="2160" w:hanging="360"/>
+      </w:pPr>
+    </w:lvl>
+    <w:lvl w:ilvl="3" w:tentative="1">
+      <w:start w:val="1"/>
+      <w:numFmt w:val="decimal"/>
+      <w:lvlText w:val="%4."/>
+      <w:lvlJc w:val="left"/>
+      <w:pPr>
+        <w:tabs>
+          <w:tab w:val="num" w:pos="2880"/>
+        </w:tabs>
+        <w:ind w:left="2880" w:hanging="360"/>
+      </w:pPr>
+    </w:lvl>
+    <w:lvl w:ilvl="4" w:tentative="1">
+      <w:start w:val="1"/>
+      <w:numFmt w:val="decimal"/>
+      <w:lvlText w:val="%5."/>
+      <w:lvlJc w:val="left"/>
+      <w:pPr>
+        <w:tabs>
+          <w:tab w:val="num" w:pos="3600"/>
+        </w:tabs>
+        <w:ind w:left="3600" w:hanging="360"/>
+      </w:pPr>
+    </w:lvl>
+    <w:lvl w:ilvl="5" w:tentative="1">
+      <w:start w:val="1"/>
+      <w:numFmt w:val="decimal"/>
+      <w:lvlText w:val="%6."/>
+      <w:lvlJc w:val="left"/>
+      <w:pPr>
+        <w:tabs>
+          <w:tab w:val="num" w:pos="4320"/>
+        </w:tabs>
+        <w:ind w:left="4320" w:hanging="360"/>
+      </w:pPr>
+    </w:lvl>
+    <w:lvl w:ilvl="6" w:tentative="1">
+      <w:start w:val="1"/>
+      <w:numFmt w:val="decimal"/>
+      <w:lvlText w:val="%7."/>
+      <w:lvlJc w:val="left"/>
+      <w:pPr>
+        <w:tabs>
+          <w:tab w:val="num" w:pos="5040"/>
+        </w:tabs>
+        <w:ind w:left="5040" w:hanging="360"/>
+      </w:pPr>
+    </w:lvl>
+    <w:lvl w:ilvl="7" w:tentative="1">
+      <w:start w:val="1"/>
+      <w:numFmt w:val="decimal"/>
+      <w:lvlText w:val="%8."/>
+      <w:lvlJc w:val="left"/>
+      <w:pPr>
+        <w:tabs>
+          <w:tab w:val="num" w:pos="5760"/>
+        </w:tabs>
+        <w:ind w:left="5760" w:hanging="360"/>
+      </w:pPr>
+    </w:lvl>
+    <w:lvl w:ilvl="8" w:tentative="1">
+      <w:start w:val="1"/>
+      <w:numFmt w:val="decimal"/>
+      <w:lvlText w:val="%9."/>
+      <w:lvlJc w:val="left"/>
+      <w:pPr>
+        <w:tabs>
+          <w:tab w:val="num" w:pos="6480"/>
+        </w:tabs>
+        <w:ind w:left="6480" w:hanging="360"/>
+      </w:pPr>
+    </w:lvl>
+  </w:abstractNum>
+  <w:abstractNum w:abstractNumId="2" w15:restartNumberingAfterBreak="0">
     <w:nsid w:val="503716C5"/>
     <w:multiLevelType w:val="multilevel"/>
     <w:tmpl w:val="8B1C4B86"/>
@@ -18430,7 +18729,7 @@
       </w:pPr>
     </w:lvl>
   </w:abstractNum>
-  <w:abstractNum w:abstractNumId="2" w15:restartNumberingAfterBreak="0">
+  <w:abstractNum w:abstractNumId="3" w15:restartNumberingAfterBreak="0">
     <w:nsid w:val="54BC7B98"/>
     <w:multiLevelType w:val="multilevel"/>
     <w:tmpl w:val="9A8EE446"/>
@@ -18543,7 +18842,7 @@
       </w:pPr>
     </w:lvl>
   </w:abstractNum>
-  <w:abstractNum w:abstractNumId="3" w15:restartNumberingAfterBreak="0">
+  <w:abstractNum w:abstractNumId="4" w15:restartNumberingAfterBreak="0">
     <w:nsid w:val="5BBB4C0C"/>
     <w:multiLevelType w:val="multilevel"/>
     <w:tmpl w:val="54162890"/>
@@ -18656,7 +18955,7 @@
       </w:pPr>
     </w:lvl>
   </w:abstractNum>
-  <w:abstractNum w:abstractNumId="4" w15:restartNumberingAfterBreak="0">
+  <w:abstractNum w:abstractNumId="5" w15:restartNumberingAfterBreak="0">
     <w:nsid w:val="67F73CF5"/>
     <w:multiLevelType w:val="multilevel"/>
     <w:tmpl w:val="A996930E"/>
@@ -18769,7 +19068,7 @@
       </w:pPr>
     </w:lvl>
   </w:abstractNum>
-  <w:abstractNum w:abstractNumId="5" w15:restartNumberingAfterBreak="0">
+  <w:abstractNum w:abstractNumId="6" w15:restartNumberingAfterBreak="0">
     <w:nsid w:val="701077D8"/>
     <w:multiLevelType w:val="multilevel"/>
     <w:tmpl w:val="ECC834A8"/>
@@ -18882,23 +19181,142 @@
       </w:pPr>
     </w:lvl>
   </w:abstractNum>
+  <w:abstractNum w:abstractNumId="7" w15:restartNumberingAfterBreak="0">
+    <w:nsid w:val="716B56B3"/>
+    <w:multiLevelType w:val="multilevel"/>
+    <w:tmpl w:val="B26A3DEA"/>
+    <w:lvl w:ilvl="0">
+      <w:start w:val="1"/>
+      <w:numFmt w:val="decimal"/>
+      <w:lvlText w:val="%1."/>
+      <w:lvlJc w:val="left"/>
+      <w:pPr>
+        <w:tabs>
+          <w:tab w:val="num" w:pos="720"/>
+        </w:tabs>
+        <w:ind w:left="720" w:hanging="360"/>
+      </w:pPr>
+    </w:lvl>
+    <w:lvl w:ilvl="1" w:tentative="1">
+      <w:start w:val="1"/>
+      <w:numFmt w:val="decimal"/>
+      <w:lvlText w:val="%2."/>
+      <w:lvlJc w:val="left"/>
+      <w:pPr>
+        <w:tabs>
+          <w:tab w:val="num" w:pos="1440"/>
+        </w:tabs>
+        <w:ind w:left="1440" w:hanging="360"/>
+      </w:pPr>
+    </w:lvl>
+    <w:lvl w:ilvl="2" w:tentative="1">
+      <w:start w:val="1"/>
+      <w:numFmt w:val="decimal"/>
+      <w:lvlText w:val="%3."/>
+      <w:lvlJc w:val="left"/>
+      <w:pPr>
+        <w:tabs>
+          <w:tab w:val="num" w:pos="2160"/>
+        </w:tabs>
+        <w:ind w:left="2160" w:hanging="360"/>
+      </w:pPr>
+    </w:lvl>
+    <w:lvl w:ilvl="3" w:tentative="1">
+      <w:start w:val="1"/>
+      <w:numFmt w:val="decimal"/>
+      <w:lvlText w:val="%4."/>
+      <w:lvlJc w:val="left"/>
+      <w:pPr>
+        <w:tabs>
+          <w:tab w:val="num" w:pos="2880"/>
+        </w:tabs>
+        <w:ind w:left="2880" w:hanging="360"/>
+      </w:pPr>
+    </w:lvl>
+    <w:lvl w:ilvl="4" w:tentative="1">
+      <w:start w:val="1"/>
+      <w:numFmt w:val="decimal"/>
+      <w:lvlText w:val="%5."/>
+      <w:lvlJc w:val="left"/>
+      <w:pPr>
+        <w:tabs>
+          <w:tab w:val="num" w:pos="3600"/>
+        </w:tabs>
+        <w:ind w:left="3600" w:hanging="360"/>
+      </w:pPr>
+    </w:lvl>
+    <w:lvl w:ilvl="5" w:tentative="1">
+      <w:start w:val="1"/>
+      <w:numFmt w:val="decimal"/>
+      <w:lvlText w:val="%6."/>
+      <w:lvlJc w:val="left"/>
+      <w:pPr>
+        <w:tabs>
+          <w:tab w:val="num" w:pos="4320"/>
+        </w:tabs>
+        <w:ind w:left="4320" w:hanging="360"/>
+      </w:pPr>
+    </w:lvl>
+    <w:lvl w:ilvl="6" w:tentative="1">
+      <w:start w:val="1"/>
+      <w:numFmt w:val="decimal"/>
+      <w:lvlText w:val="%7."/>
+      <w:lvlJc w:val="left"/>
+      <w:pPr>
+        <w:tabs>
+          <w:tab w:val="num" w:pos="5040"/>
+        </w:tabs>
+        <w:ind w:left="5040" w:hanging="360"/>
+      </w:pPr>
+    </w:lvl>
+    <w:lvl w:ilvl="7" w:tentative="1">
+      <w:start w:val="1"/>
+      <w:numFmt w:val="decimal"/>
+      <w:lvlText w:val="%8."/>
+      <w:lvlJc w:val="left"/>
+      <w:pPr>
+        <w:tabs>
+          <w:tab w:val="num" w:pos="5760"/>
+        </w:tabs>
+        <w:ind w:left="5760" w:hanging="360"/>
+      </w:pPr>
+    </w:lvl>
+    <w:lvl w:ilvl="8" w:tentative="1">
+      <w:start w:val="1"/>
+      <w:numFmt w:val="decimal"/>
+      <w:lvlText w:val="%9."/>
+      <w:lvlJc w:val="left"/>
+      <w:pPr>
+        <w:tabs>
+          <w:tab w:val="num" w:pos="6480"/>
+        </w:tabs>
+        <w:ind w:left="6480" w:hanging="360"/>
+      </w:pPr>
+    </w:lvl>
+  </w:abstractNum>
   <w:num w:numId="1" w16cid:durableId="1330862168">
-    <w:abstractNumId w:val="3"/>
+    <w:abstractNumId w:val="4"/>
   </w:num>
   <w:num w:numId="2" w16cid:durableId="1234924971">
+    <w:abstractNumId w:val="6"/>
+  </w:num>
+  <w:num w:numId="3" w16cid:durableId="2038726092">
     <w:abstractNumId w:val="5"/>
   </w:num>
-  <w:num w:numId="3" w16cid:durableId="2038726092">
-    <w:abstractNumId w:val="4"/>
-  </w:num>
   <w:num w:numId="4" w16cid:durableId="1726174041">
-    <w:abstractNumId w:val="1"/>
+    <w:abstractNumId w:val="2"/>
   </w:num>
   <w:num w:numId="5" w16cid:durableId="115876599">
-    <w:abstractNumId w:val="2"/>
+    <w:abstractNumId w:val="3"/>
   </w:num>
   <w:num w:numId="6" w16cid:durableId="662466732">
     <w:abstractNumId w:val="0"/>
+  </w:num>
+  <w:num w:numId="7" w16cid:durableId="1207568512">
+    <w:abstractNumId w:val="7"/>
+  </w:num>
+  <w:num w:numId="8" w16cid:durableId="1855878255">
+    <w:abstractNumId w:val="1"/>
   </w:num>
 </w:numbering>
 </file>

</xml_diff>

<commit_message>
SN QB Ans 40 Fix
</commit_message>
<xml_diff>
--- a/SN - Social Networks/SN_QB_Ans.docx
+++ b/SN - Social Networks/SN_QB_Ans.docx
@@ -396,7 +396,25 @@
                 <w:sz w:val="28"/>
                 <w:szCs w:val="28"/>
               </w:rPr>
-              <w:t>However, social networks also present various challenges. These include scalability, as they must handle a large number of users and interactions, data privacy, as user data must be protected and not misused, misinformation and fake news, as these can have serious consequences, and trolls and cyberbullying, which can lead to negative experiences for users. Additionally, social networks can challenge traditional social norms and values, leading to conflicts and disagreements.</w:t>
+              <w:t xml:space="preserve">However, social networks also present various challenges. These include scalability, as they must handle </w:t>
+            </w:r>
+            <w:proofErr w:type="gramStart"/>
+            <w:r>
+              <w:rPr>
+                <w:rFonts w:asciiTheme="minorHAnsi" w:hAnsiTheme="minorHAnsi" w:cstheme="minorHAnsi"/>
+                <w:sz w:val="28"/>
+                <w:szCs w:val="28"/>
+              </w:rPr>
+              <w:t>a large number of</w:t>
+            </w:r>
+            <w:proofErr w:type="gramEnd"/>
+            <w:r>
+              <w:rPr>
+                <w:rFonts w:asciiTheme="minorHAnsi" w:hAnsiTheme="minorHAnsi" w:cstheme="minorHAnsi"/>
+                <w:sz w:val="28"/>
+                <w:szCs w:val="28"/>
+              </w:rPr>
+              <w:t xml:space="preserve"> users and interactions, data privacy, as user data must be protected and not misused, misinformation and fake news, as these can have serious consequences, and trolls and cyberbullying, which can lead to negative experiences for users. Additionally, social networks can challenge traditional social norms and values, leading to conflicts and disagreements.</w:t>
             </w:r>
           </w:p>
           <w:p>
@@ -736,7 +754,27 @@
                 <w:szCs w:val="28"/>
                 <w:lang w:val="en-IN"/>
               </w:rPr>
-              <w:t>Scalability: Social networks must handle a large number of users and interactions, which can be challenging to manage and analyze.</w:t>
+              <w:t xml:space="preserve">Scalability: Social networks must handle </w:t>
+            </w:r>
+            <w:proofErr w:type="gramStart"/>
+            <w:r>
+              <w:rPr>
+                <w:rFonts w:asciiTheme="minorHAnsi" w:hAnsiTheme="minorHAnsi" w:cstheme="minorHAnsi"/>
+                <w:sz w:val="28"/>
+                <w:szCs w:val="28"/>
+                <w:lang w:val="en-IN"/>
+              </w:rPr>
+              <w:t>a large number of</w:t>
+            </w:r>
+            <w:proofErr w:type="gramEnd"/>
+            <w:r>
+              <w:rPr>
+                <w:rFonts w:asciiTheme="minorHAnsi" w:hAnsiTheme="minorHAnsi" w:cstheme="minorHAnsi"/>
+                <w:sz w:val="28"/>
+                <w:szCs w:val="28"/>
+                <w:lang w:val="en-IN"/>
+              </w:rPr>
+              <w:t xml:space="preserve"> users and interactions, which can be challenging to manage and analyze.</w:t>
             </w:r>
           </w:p>
           <w:p>
@@ -2045,7 +2083,27 @@
                 <w:szCs w:val="28"/>
                 <w:lang w:val="en-IN"/>
               </w:rPr>
-              <w:t>: Reducing the size of the data without losing important information, allowing for more efficient storage and processing.</w:t>
+              <w:t xml:space="preserve">: Reducing the size of the data without losing important information, allowing for more efficient </w:t>
+            </w:r>
+            <w:proofErr w:type="gramStart"/>
+            <w:r>
+              <w:rPr>
+                <w:rFonts w:asciiTheme="minorHAnsi" w:hAnsiTheme="minorHAnsi" w:cstheme="minorHAnsi"/>
+                <w:sz w:val="28"/>
+                <w:szCs w:val="28"/>
+                <w:lang w:val="en-IN"/>
+              </w:rPr>
+              <w:t>storage</w:t>
+            </w:r>
+            <w:proofErr w:type="gramEnd"/>
+            <w:r>
+              <w:rPr>
+                <w:rFonts w:asciiTheme="minorHAnsi" w:hAnsiTheme="minorHAnsi" w:cstheme="minorHAnsi"/>
+                <w:sz w:val="28"/>
+                <w:szCs w:val="28"/>
+                <w:lang w:val="en-IN"/>
+              </w:rPr>
+              <w:t xml:space="preserve"> and processing.</w:t>
             </w:r>
           </w:p>
           <w:p>
@@ -4426,13 +4484,41 @@
                 <w:szCs w:val="28"/>
               </w:rPr>
             </w:pPr>
-            <w:r>
-              <w:rPr>
-                <w:rFonts w:asciiTheme="minorHAnsi" w:hAnsiTheme="minorHAnsi" w:cstheme="minorHAnsi"/>
-                <w:sz w:val="28"/>
-                <w:szCs w:val="28"/>
-              </w:rPr>
-              <w:t>In order to be successful in marketing on social networks, it is important to have a clear understanding of the target audience, as well as to create engaging and relevant content. It is also important to monitor social media metrics, such as engagement rates, click-through rates, and conversion rates, in order to measure the effectiveness of social media marketing campaigns and make data-driven decisions.</w:t>
+            <w:proofErr w:type="gramStart"/>
+            <w:r>
+              <w:rPr>
+                <w:rFonts w:asciiTheme="minorHAnsi" w:hAnsiTheme="minorHAnsi" w:cstheme="minorHAnsi"/>
+                <w:sz w:val="28"/>
+                <w:szCs w:val="28"/>
+              </w:rPr>
+              <w:t>In order to</w:t>
+            </w:r>
+            <w:proofErr w:type="gramEnd"/>
+            <w:r>
+              <w:rPr>
+                <w:rFonts w:asciiTheme="minorHAnsi" w:hAnsiTheme="minorHAnsi" w:cstheme="minorHAnsi"/>
+                <w:sz w:val="28"/>
+                <w:szCs w:val="28"/>
+              </w:rPr>
+              <w:t xml:space="preserve"> be successful in marketing on social networks, it is important to have a clear understanding of the target audience, as well as to create engaging and relevant content. It is also important to monitor social media metrics, such as engagement rates, click-through rates, and conversion rates, </w:t>
+            </w:r>
+            <w:proofErr w:type="gramStart"/>
+            <w:r>
+              <w:rPr>
+                <w:rFonts w:asciiTheme="minorHAnsi" w:hAnsiTheme="minorHAnsi" w:cstheme="minorHAnsi"/>
+                <w:sz w:val="28"/>
+                <w:szCs w:val="28"/>
+              </w:rPr>
+              <w:t>in order to</w:t>
+            </w:r>
+            <w:proofErr w:type="gramEnd"/>
+            <w:r>
+              <w:rPr>
+                <w:rFonts w:asciiTheme="minorHAnsi" w:hAnsiTheme="minorHAnsi" w:cstheme="minorHAnsi"/>
+                <w:sz w:val="28"/>
+                <w:szCs w:val="28"/>
+              </w:rPr>
+              <w:t xml:space="preserve"> measure the effectiveness of social media marketing campaigns and make data-driven decisions.</w:t>
             </w:r>
           </w:p>
           <w:p>
@@ -4729,7 +4815,25 @@
                 <w:sz w:val="28"/>
                 <w:szCs w:val="28"/>
               </w:rPr>
-              <w:t>One common approach to searching in a network is to use graph traversal algorithms, such as breadth-first search (BFS) or depth-first search (DFS). These algorithms explore the nodes of a graph in a systematic way, starting from a given node and visiting all of its neighbors before moving on to the next level of the graph.</w:t>
+              <w:t xml:space="preserve">One common approach to searching in a network is to use graph traversal algorithms, such as breadth-first search (BFS) or depth-first search (DFS). These algorithms explore the nodes of a graph in a systematic way, starting from a given node and visiting </w:t>
+            </w:r>
+            <w:proofErr w:type="gramStart"/>
+            <w:r>
+              <w:rPr>
+                <w:rFonts w:asciiTheme="minorHAnsi" w:hAnsiTheme="minorHAnsi" w:cstheme="minorHAnsi"/>
+                <w:sz w:val="28"/>
+                <w:szCs w:val="28"/>
+              </w:rPr>
+              <w:t>all of</w:t>
+            </w:r>
+            <w:proofErr w:type="gramEnd"/>
+            <w:r>
+              <w:rPr>
+                <w:rFonts w:asciiTheme="minorHAnsi" w:hAnsiTheme="minorHAnsi" w:cstheme="minorHAnsi"/>
+                <w:sz w:val="28"/>
+                <w:szCs w:val="28"/>
+              </w:rPr>
+              <w:t xml:space="preserve"> its neighbors before moving on to the next level of the graph.</w:t>
             </w:r>
           </w:p>
           <w:p>
@@ -6852,7 +6956,23 @@
                 <w:sz w:val="28"/>
                 <w:szCs w:val="28"/>
               </w:rPr>
-              <w:t>In summary, positive and negative relationships have distinct impacts on social networks. Positive relationships can lead to increased trust, cooperation, and cohesion, while negative relationships can lead to conflict, competition, and mistrust. Understanding the characteristics and impacts of positive and negative relationships is crucial for analyzing and designing effective social networks.</w:t>
+              <w:t xml:space="preserve">In summary, </w:t>
+            </w:r>
+            <w:proofErr w:type="gramStart"/>
+            <w:r>
+              <w:rPr>
+                <w:sz w:val="28"/>
+                <w:szCs w:val="28"/>
+              </w:rPr>
+              <w:t>positive</w:t>
+            </w:r>
+            <w:proofErr w:type="gramEnd"/>
+            <w:r>
+              <w:rPr>
+                <w:sz w:val="28"/>
+                <w:szCs w:val="28"/>
+              </w:rPr>
+              <w:t xml:space="preserve"> and negative relationships have distinct impacts on social networks. Positive relationships can lead to increased trust, cooperation, and cohesion, while negative relationships can lead to conflict, competition, and mistrust. Understanding the characteristics and impacts of positive and negative relationships is crucial for analyzing and designing effective social networks.</w:t>
             </w:r>
           </w:p>
         </w:tc>
@@ -7155,7 +7275,23 @@
                 <w:sz w:val="28"/>
                 <w:szCs w:val="28"/>
               </w:rPr>
-              <w:t>Homophily refers to the phenomenon where individuals tend to form relationships with others who are similar to themselves in terms of certain attributes, such as age, gender, race, education, or interests. It is a common characteristic in social networks, where individuals are more likely to connect with others who share their values, beliefs, and behaviors.</w:t>
+              <w:t xml:space="preserve">Homophily refers to the phenomenon where individuals tend to form relationships with others who are </w:t>
+            </w:r>
+            <w:proofErr w:type="gramStart"/>
+            <w:r>
+              <w:rPr>
+                <w:sz w:val="28"/>
+                <w:szCs w:val="28"/>
+              </w:rPr>
+              <w:t>similar to</w:t>
+            </w:r>
+            <w:proofErr w:type="gramEnd"/>
+            <w:r>
+              <w:rPr>
+                <w:sz w:val="28"/>
+                <w:szCs w:val="28"/>
+              </w:rPr>
+              <w:t xml:space="preserve"> themselves in terms of certain attributes, such as age, gender, race, education, or interests. It is a common characteristic in social networks, where individuals are more likely to connect with others who share their values, beliefs, and behaviors.</w:t>
             </w:r>
           </w:p>
           <w:p>
@@ -8157,7 +8293,23 @@
                 <w:sz w:val="28"/>
                 <w:szCs w:val="28"/>
               </w:rPr>
-              <w:t>The algorithm has several advantages over other community detection algorithms, including its ability to identify overlapping communities, where nodes can belong to multiple communities, and its ability to handle weighted networks, where edges have associated weights that reflect their importance. However, the algorithm can be computationally expensive for large networks, and its performance can be sensitive to the choice of betweenness centrality measure and the threshold used to remove edges.</w:t>
+              <w:t xml:space="preserve">The algorithm has several advantages over other community detection algorithms, including its ability to identify overlapping communities, where nodes can belong to multiple communities, and its ability to handle weighted networks, where edges have associated weights that reflect their importance. However, the algorithm can be computationally expensive for large networks, and its performance can be sensitive to the choice of betweenness centrality </w:t>
+            </w:r>
+            <w:proofErr w:type="gramStart"/>
+            <w:r>
+              <w:rPr>
+                <w:sz w:val="28"/>
+                <w:szCs w:val="28"/>
+              </w:rPr>
+              <w:t>measure</w:t>
+            </w:r>
+            <w:proofErr w:type="gramEnd"/>
+            <w:r>
+              <w:rPr>
+                <w:sz w:val="28"/>
+                <w:szCs w:val="28"/>
+              </w:rPr>
+              <w:t xml:space="preserve"> and the threshold used to remove edges.</w:t>
             </w:r>
           </w:p>
           <w:p>
@@ -9318,7 +9470,23 @@
                 <w:sz w:val="28"/>
                 <w:szCs w:val="28"/>
               </w:rPr>
-              <w:t>The richer-get-richer phenomenon, also known as the Matthew effect, is a social phenomenon where individuals who are already successful or have more resources tend to accumulate even more resources or success, while those who are less successful or have fewer resources tend to fall further behind. In the context of networks, this phenomenon can be observed in the preferential attachment process, where new nodes tend to connect to existing nodes with higher degrees, leading to the formation of hubs and a power-law distribution of node degrees[1].</w:t>
+              <w:t xml:space="preserve">The richer-get-richer phenomenon, also known as the Matthew effect, is a social phenomenon where individuals who are already successful or have more resources tend to accumulate even more resources or success, while those who are less successful or have fewer resources tend to fall further behind. In the context of networks, this phenomenon can be observed in the preferential attachment process, where new nodes tend to connect to existing nodes with higher degrees, leading to the formation of hubs and a power-law distribution of node </w:t>
+            </w:r>
+            <w:proofErr w:type="gramStart"/>
+            <w:r>
+              <w:rPr>
+                <w:sz w:val="28"/>
+                <w:szCs w:val="28"/>
+              </w:rPr>
+              <w:t>degrees[</w:t>
+            </w:r>
+            <w:proofErr w:type="gramEnd"/>
+            <w:r>
+              <w:rPr>
+                <w:sz w:val="28"/>
+                <w:szCs w:val="28"/>
+              </w:rPr>
+              <w:t>1].</w:t>
             </w:r>
           </w:p>
           <w:p>
@@ -9345,7 +9513,23 @@
                 <w:sz w:val="28"/>
                 <w:szCs w:val="28"/>
               </w:rPr>
-              <w:t>In a network, the richer-get-richer phenomenon can lead to the formation of highly connected nodes, or hubs, which have a disproportionately large number of connections compared to other nodes in the network. These hubs can have a significant impact on the overall structure and behavior of the network, as they can act as central points of connectivity and influence[1].</w:t>
+              <w:t xml:space="preserve">In a network, the richer-get-richer phenomenon can lead to the formation of highly connected nodes, or hubs, which have a disproportionately large number of connections compared to other nodes in the network. These hubs can have a significant impact on the overall structure and behavior of the network, as they can act as central points of connectivity and </w:t>
+            </w:r>
+            <w:proofErr w:type="gramStart"/>
+            <w:r>
+              <w:rPr>
+                <w:sz w:val="28"/>
+                <w:szCs w:val="28"/>
+              </w:rPr>
+              <w:t>influence[</w:t>
+            </w:r>
+            <w:proofErr w:type="gramEnd"/>
+            <w:r>
+              <w:rPr>
+                <w:sz w:val="28"/>
+                <w:szCs w:val="28"/>
+              </w:rPr>
+              <w:t>1].</w:t>
             </w:r>
           </w:p>
           <w:p>
@@ -10167,7 +10351,23 @@
                 <w:sz w:val="28"/>
                 <w:szCs w:val="28"/>
               </w:rPr>
-              <w:t>Power laws are a type of distribution that is often observed in social networks, where a few nodes have a very high degree (number of connections) and many nodes have a low degree. This is also known as the "rich-get-richer" phenomenon, where nodes with a high degree are more likely to attract new connections.</w:t>
+              <w:t>Power laws are a type of distribution that is often observed in social networks, where a few nodes have a very high degree (number of connections</w:t>
+            </w:r>
+            <w:proofErr w:type="gramStart"/>
+            <w:r>
+              <w:rPr>
+                <w:sz w:val="28"/>
+                <w:szCs w:val="28"/>
+              </w:rPr>
+              <w:t>)</w:t>
+            </w:r>
+            <w:proofErr w:type="gramEnd"/>
+            <w:r>
+              <w:rPr>
+                <w:sz w:val="28"/>
+                <w:szCs w:val="28"/>
+              </w:rPr>
+              <w:t xml:space="preserve"> and many nodes have a low degree. This is also known as the "rich-get-richer" phenomenon, where nodes with a high degree are more likely to attract new connections.</w:t>
             </w:r>
           </w:p>
           <w:p>
@@ -10659,32 +10859,64 @@
                 <w:sz w:val="28"/>
                 <w:szCs w:val="28"/>
               </w:rPr>
-              <w:t>One example of a linked analysis algorithm is the Girvan-Newman algorithm, which is used for community detection in networks. This algorithm works by iteratively removing edges from the network based on their betweenness centrality, which is a measure of how many shortest paths in the network pass through that edge. By removing edges with high betweenness centrality, the algorithm is able to identify communities in the network, which are groups of nodes that are more densely connected to each other than to the rest of the network.</w:t>
-            </w:r>
-          </w:p>
-          <w:p>
-            <w:pPr>
-              <w:pStyle w:val="TableParagraph"/>
-              <w:rPr>
-                <w:sz w:val="28"/>
-                <w:szCs w:val="28"/>
-              </w:rPr>
-            </w:pPr>
-          </w:p>
-          <w:p>
-            <w:pPr>
-              <w:pStyle w:val="TableParagraph"/>
-              <w:rPr>
-                <w:sz w:val="28"/>
-                <w:szCs w:val="28"/>
-              </w:rPr>
-            </w:pPr>
-            <w:r>
-              <w:rPr>
-                <w:sz w:val="28"/>
-                <w:szCs w:val="28"/>
-              </w:rPr>
-              <w:t>Another example of a linked analysis algorithm is the PageRank algorithm, which is used to rank the importance of nodes in a network. This algorithm works by distributing a set of virtual "link juice" or "rank" to each node in the network, based on the number and quality of links pointing to that node. The nodes that receive the most link juice are considered to be the most important nodes in the network.</w:t>
+              <w:t xml:space="preserve">One example of a linked analysis algorithm is the Girvan-Newman algorithm, which is used for community detection in networks. This algorithm works by iteratively removing edges from the network based on their betweenness centrality, which is a measure of how many shortest paths in the network pass through that edge. By removing edges with high betweenness centrality, the algorithm </w:t>
+            </w:r>
+            <w:proofErr w:type="gramStart"/>
+            <w:r>
+              <w:rPr>
+                <w:sz w:val="28"/>
+                <w:szCs w:val="28"/>
+              </w:rPr>
+              <w:t>is able to</w:t>
+            </w:r>
+            <w:proofErr w:type="gramEnd"/>
+            <w:r>
+              <w:rPr>
+                <w:sz w:val="28"/>
+                <w:szCs w:val="28"/>
+              </w:rPr>
+              <w:t xml:space="preserve"> identify communities in the network, which are groups of nodes that are more densely connected to each other than to the rest of the network.</w:t>
+            </w:r>
+          </w:p>
+          <w:p>
+            <w:pPr>
+              <w:pStyle w:val="TableParagraph"/>
+              <w:rPr>
+                <w:sz w:val="28"/>
+                <w:szCs w:val="28"/>
+              </w:rPr>
+            </w:pPr>
+          </w:p>
+          <w:p>
+            <w:pPr>
+              <w:pStyle w:val="TableParagraph"/>
+              <w:rPr>
+                <w:sz w:val="28"/>
+                <w:szCs w:val="28"/>
+              </w:rPr>
+            </w:pPr>
+            <w:r>
+              <w:rPr>
+                <w:sz w:val="28"/>
+                <w:szCs w:val="28"/>
+              </w:rPr>
+              <w:t xml:space="preserve">Another example of a linked analysis algorithm is the PageRank algorithm, which is used to rank the importance of nodes in a network. This algorithm works by distributing a set of virtual "link juice" or "rank" to each node in the network, based on the number and quality of links pointing to that node. The nodes that receive the most link juice </w:t>
+            </w:r>
+            <w:proofErr w:type="gramStart"/>
+            <w:r>
+              <w:rPr>
+                <w:sz w:val="28"/>
+                <w:szCs w:val="28"/>
+              </w:rPr>
+              <w:t>are</w:t>
+            </w:r>
+            <w:proofErr w:type="gramEnd"/>
+            <w:r>
+              <w:rPr>
+                <w:sz w:val="28"/>
+                <w:szCs w:val="28"/>
+              </w:rPr>
+              <w:t xml:space="preserve"> considered to be the most important nodes in the network.</w:t>
             </w:r>
           </w:p>
           <w:p>
@@ -11844,7 +12076,23 @@
                 <w:sz w:val="28"/>
                 <w:szCs w:val="28"/>
               </w:rPr>
-              <w:t xml:space="preserve"> After adding a new person, connections are established between this individual and existing nodes in the network. The connections are formed based on the principles of homophily, where individuals with similar attributes are more likely to connect.</w:t>
+              <w:t xml:space="preserve"> After adding a new person, connections are established between </w:t>
+            </w:r>
+            <w:proofErr w:type="gramStart"/>
+            <w:r>
+              <w:rPr>
+                <w:sz w:val="28"/>
+                <w:szCs w:val="28"/>
+              </w:rPr>
+              <w:t>this individual and existing nodes</w:t>
+            </w:r>
+            <w:proofErr w:type="gramEnd"/>
+            <w:r>
+              <w:rPr>
+                <w:sz w:val="28"/>
+                <w:szCs w:val="28"/>
+              </w:rPr>
+              <w:t xml:space="preserve"> in the network. The connections are formed based on the principles of homophily, where individuals with similar attributes are more likely to connect.</w:t>
             </w:r>
           </w:p>
           <w:p>
@@ -13231,7 +13479,23 @@
                 <w:sz w:val="28"/>
                 <w:szCs w:val="28"/>
               </w:rPr>
-              <w:t>Spatial segregation refers to the phenomenon where individuals or groups tend to be separated or clustered in certain areas based on their social or demographic characteristics. This can lead to the formation of distinct social networks and communities, where individuals have a higher likelihood of forming connections with others who are similar to them and live in close proximity.</w:t>
+              <w:t xml:space="preserve">Spatial segregation refers to the phenomenon where individuals or groups tend to be separated or clustered in certain areas based on their social or demographic characteristics. This can lead to the formation of distinct social networks and communities, where individuals have a higher likelihood of forming connections with others who are </w:t>
+            </w:r>
+            <w:proofErr w:type="gramStart"/>
+            <w:r>
+              <w:rPr>
+                <w:sz w:val="28"/>
+                <w:szCs w:val="28"/>
+              </w:rPr>
+              <w:t>similar to</w:t>
+            </w:r>
+            <w:proofErr w:type="gramEnd"/>
+            <w:r>
+              <w:rPr>
+                <w:sz w:val="28"/>
+                <w:szCs w:val="28"/>
+              </w:rPr>
+              <w:t xml:space="preserve"> them and live in close proximity.</w:t>
             </w:r>
           </w:p>
           <w:p>
@@ -13306,7 +13570,23 @@
                 <w:sz w:val="28"/>
                 <w:szCs w:val="28"/>
               </w:rPr>
-              <w:t>To understand the impact of spatial segregation on social networks, researchers often use techniques such as network analysis, spatial analysis, and geographic information systems (GIS) to analyze the structure and dynamics of social networks in different geographic areas. By combining these techniques, researchers can identify patterns of spatial segregation and their impact on social networks, and develop strategies to promote social integration and reduce spatial segregation.</w:t>
+              <w:t xml:space="preserve">To understand the impact of spatial segregation on social networks, researchers often use techniques such as network analysis, spatial analysis, and geographic information systems (GIS) to analyze the structure and dynamics of social networks in different geographic areas. By combining these techniques, researchers can identify patterns of spatial segregation and their impact on social </w:t>
+            </w:r>
+            <w:proofErr w:type="gramStart"/>
+            <w:r>
+              <w:rPr>
+                <w:sz w:val="28"/>
+                <w:szCs w:val="28"/>
+              </w:rPr>
+              <w:t>networks, and</w:t>
+            </w:r>
+            <w:proofErr w:type="gramEnd"/>
+            <w:r>
+              <w:rPr>
+                <w:sz w:val="28"/>
+                <w:szCs w:val="28"/>
+              </w:rPr>
+              <w:t xml:space="preserve"> develop strategies to promote social integration and reduce spatial segregation.</w:t>
             </w:r>
           </w:p>
           <w:p>
@@ -13604,7 +13884,23 @@
                 <w:sz w:val="28"/>
                 <w:szCs w:val="28"/>
               </w:rPr>
-              <w:t>The basic idea of the Schelling Model is to simulate the behavior of a group of agents who have a preference for living near other agents who are similar to them. Each agent is represented as a point on a grid, and the grid represents a two-dimensional space. The agents have a tolerance level, which determines the minimum fraction of similar agents they need to be satisfied. If an agent is not satisfied, it moves to a random location on the grid where it is more likely to find a higher concentration of similar agents.</w:t>
+              <w:t xml:space="preserve">The basic idea of the Schelling Model is to simulate the behavior of a group of agents who </w:t>
+            </w:r>
+            <w:proofErr w:type="gramStart"/>
+            <w:r>
+              <w:rPr>
+                <w:sz w:val="28"/>
+                <w:szCs w:val="28"/>
+              </w:rPr>
+              <w:t>have a preference for</w:t>
+            </w:r>
+            <w:proofErr w:type="gramEnd"/>
+            <w:r>
+              <w:rPr>
+                <w:sz w:val="28"/>
+                <w:szCs w:val="28"/>
+              </w:rPr>
+              <w:t xml:space="preserve"> living near other agents who are similar to them. Each agent is represented as a point on a grid, and the grid represents a two-dimensional space. The agents have a tolerance level, which determines the minimum fraction of similar agents they need to be satisfied. If an agent is not satisfied, it moves to a random location on the grid where it is more likely to find a higher concentration of similar agents.</w:t>
             </w:r>
           </w:p>
           <w:p>
@@ -13763,7 +14059,23 @@
                 <w:sz w:val="28"/>
                 <w:szCs w:val="28"/>
               </w:rPr>
-              <w:t xml:space="preserve"> Steps 3 and 4 are repeated for a number of iterations until the system reaches a steady state.</w:t>
+              <w:t xml:space="preserve"> Steps 3 and 4 are repeated for </w:t>
+            </w:r>
+            <w:proofErr w:type="gramStart"/>
+            <w:r>
+              <w:rPr>
+                <w:sz w:val="28"/>
+                <w:szCs w:val="28"/>
+              </w:rPr>
+              <w:t>a number of</w:t>
+            </w:r>
+            <w:proofErr w:type="gramEnd"/>
+            <w:r>
+              <w:rPr>
+                <w:sz w:val="28"/>
+                <w:szCs w:val="28"/>
+              </w:rPr>
+              <w:t xml:space="preserve"> iterations until the system reaches a steady state.</w:t>
             </w:r>
           </w:p>
           <w:p>
@@ -13813,7 +14125,23 @@
                 <w:sz w:val="28"/>
                 <w:szCs w:val="28"/>
               </w:rPr>
-              <w:t>The Schelling Model is implemented in several programming languages, including Python, R, and MATLAB. The implementation involves creating a grid to represent the two-dimensional space, initializing the agents with their attributes and tolerance levels, and running the simulation for a number of iterations. The output of the simulation can be visualized as a heatmap or a choropleth map to show the distribution of agents and the degree of segregation in the network.</w:t>
+              <w:t xml:space="preserve">The Schelling Model is implemented in several programming languages, including Python, R, and MATLAB. The implementation involves creating a grid to represent the two-dimensional space, initializing the agents with their attributes and tolerance levels, and running the simulation for </w:t>
+            </w:r>
+            <w:proofErr w:type="gramStart"/>
+            <w:r>
+              <w:rPr>
+                <w:sz w:val="28"/>
+                <w:szCs w:val="28"/>
+              </w:rPr>
+              <w:t>a number of</w:t>
+            </w:r>
+            <w:proofErr w:type="gramEnd"/>
+            <w:r>
+              <w:rPr>
+                <w:sz w:val="28"/>
+                <w:szCs w:val="28"/>
+              </w:rPr>
+              <w:t xml:space="preserve"> iterations. The output of the simulation can be visualized as a heatmap or a choropleth map to show the distribution of agents and the degree of segregation in the network.</w:t>
             </w:r>
           </w:p>
           <w:p>
@@ -13839,7 +14167,23 @@
                 <w:sz w:val="28"/>
                 <w:szCs w:val="28"/>
               </w:rPr>
-              <w:t>In summary, the Schelling Model is a powerful tool for studying the dynamics of spatial segregation in social networks. The model can help to understand the emergence of segregated communities and the impact of individual preferences on the overall structure of the network. The implementation of the model involves creating a grid to represent the two-dimensional space, initializing the agents with their attributes and tolerance levels, and running the simulation for a number of iterations. The output of the simulation can be visualized to show the distribution of agents and the degree of segregation in the network.</w:t>
+              <w:t xml:space="preserve">In summary, the Schelling Model is a powerful tool for studying the dynamics of spatial segregation in social networks. The model can help to understand the emergence of segregated communities and the impact of individual preferences on the overall structure of the network. The implementation of the model involves creating a grid to represent the two-dimensional space, initializing the agents with their attributes and tolerance levels, and running the simulation for </w:t>
+            </w:r>
+            <w:proofErr w:type="gramStart"/>
+            <w:r>
+              <w:rPr>
+                <w:sz w:val="28"/>
+                <w:szCs w:val="28"/>
+              </w:rPr>
+              <w:t>a number of</w:t>
+            </w:r>
+            <w:proofErr w:type="gramEnd"/>
+            <w:r>
+              <w:rPr>
+                <w:sz w:val="28"/>
+                <w:szCs w:val="28"/>
+              </w:rPr>
+              <w:t xml:space="preserve"> iterations. The output of the simulation can be visualized to show the distribution of agents and the degree of segregation in the network.</w:t>
             </w:r>
           </w:p>
         </w:tc>
@@ -14122,7 +14466,23 @@
                 <w:sz w:val="28"/>
                 <w:szCs w:val="28"/>
               </w:rPr>
-              <w:t>The concept of "enemy's enemy is a friend" is a principle in social network analysis that suggests that individuals or groups with shared enemies or adversaries can form alliances or relationships based on their common interests. This principle is often observed in situations where individuals or groups have a common goal or objective, but may have different perspectives or approaches to achieving that goal.</w:t>
+              <w:t xml:space="preserve">The concept of "enemy's enemy is a friend" is a principle in social network analysis that suggests that individuals or groups with shared enemies or adversaries can form alliances or relationships based on their common interests. This principle is often observed in situations where individuals or groups have a common goal or </w:t>
+            </w:r>
+            <w:proofErr w:type="gramStart"/>
+            <w:r>
+              <w:rPr>
+                <w:sz w:val="28"/>
+                <w:szCs w:val="28"/>
+              </w:rPr>
+              <w:t>objective, but</w:t>
+            </w:r>
+            <w:proofErr w:type="gramEnd"/>
+            <w:r>
+              <w:rPr>
+                <w:sz w:val="28"/>
+                <w:szCs w:val="28"/>
+              </w:rPr>
+              <w:t xml:space="preserve"> may have different perspectives or approaches to achieving that goal.</w:t>
             </w:r>
           </w:p>
           <w:p>
@@ -14223,7 +14583,23 @@
                 <w:sz w:val="28"/>
                 <w:szCs w:val="28"/>
               </w:rPr>
-              <w:t>Overall, the principle of "enemy's enemy is a friend" is a fundamental concept in social network analysis that highlights the complex and dynamic nature of social relationships and interactions. By understanding the principles and mechanisms that govern these relationships, researchers can gain insights into the structure and behavior of social networks, and develop strategies to promote positive social outcomes.</w:t>
+              <w:t xml:space="preserve">Overall, the principle of "enemy's enemy is a friend" is a fundamental concept in social network analysis that highlights the complex and dynamic nature of social relationships and interactions. By understanding the principles and mechanisms that govern these relationships, researchers can gain insights into the structure and behavior of social </w:t>
+            </w:r>
+            <w:proofErr w:type="gramStart"/>
+            <w:r>
+              <w:rPr>
+                <w:sz w:val="28"/>
+                <w:szCs w:val="28"/>
+              </w:rPr>
+              <w:t>networks, and</w:t>
+            </w:r>
+            <w:proofErr w:type="gramEnd"/>
+            <w:r>
+              <w:rPr>
+                <w:sz w:val="28"/>
+                <w:szCs w:val="28"/>
+              </w:rPr>
+              <w:t xml:space="preserve"> develop strategies to promote positive social outcomes.</w:t>
             </w:r>
           </w:p>
         </w:tc>
@@ -14886,7 +15262,23 @@
                 <w:sz w:val="28"/>
                 <w:szCs w:val="28"/>
               </w:rPr>
-              <w:t>The "equal coin distribution" is an example of how probability theory can be used to explain seemingly unlikely events in social networks. By understanding the underlying probabilities, researchers can gain insights into the structure and behavior of social networks, and develop strategies to promote positive social outcomes.</w:t>
+              <w:t xml:space="preserve">The "equal coin distribution" is an example of how probability theory can be used to explain seemingly unlikely events in social networks. By understanding the underlying probabilities, researchers can gain insights into the structure and behavior of social </w:t>
+            </w:r>
+            <w:proofErr w:type="gramStart"/>
+            <w:r>
+              <w:rPr>
+                <w:sz w:val="28"/>
+                <w:szCs w:val="28"/>
+              </w:rPr>
+              <w:t>networks, and</w:t>
+            </w:r>
+            <w:proofErr w:type="gramEnd"/>
+            <w:r>
+              <w:rPr>
+                <w:sz w:val="28"/>
+                <w:szCs w:val="28"/>
+              </w:rPr>
+              <w:t xml:space="preserve"> develop strategies to promote positive social outcomes.</w:t>
             </w:r>
           </w:p>
         </w:tc>
@@ -15272,7 +15664,23 @@
                 <w:sz w:val="28"/>
                 <w:szCs w:val="28"/>
               </w:rPr>
-              <w:t>The web graph can be represented as a matrix, where each row and column corresponds to a web page, and the entries in the matrix represent the links between web pages.</w:t>
+              <w:t xml:space="preserve">The web graph can be represented as a matrix, where each row and column </w:t>
+            </w:r>
+            <w:proofErr w:type="gramStart"/>
+            <w:r>
+              <w:rPr>
+                <w:sz w:val="28"/>
+                <w:szCs w:val="28"/>
+              </w:rPr>
+              <w:t>corresponds</w:t>
+            </w:r>
+            <w:proofErr w:type="gramEnd"/>
+            <w:r>
+              <w:rPr>
+                <w:sz w:val="28"/>
+                <w:szCs w:val="28"/>
+              </w:rPr>
+              <w:t xml:space="preserve"> to a web page, and the entries in the matrix represent the links between web pages.</w:t>
             </w:r>
           </w:p>
           <w:p>
@@ -15324,7 +15732,23 @@
                 <w:sz w:val="28"/>
                 <w:szCs w:val="28"/>
               </w:rPr>
-              <w:t>The PageRank scores can be calculated by running the PageRank algorithm for a sufficient number of iterations until the scores converge.</w:t>
+              <w:t xml:space="preserve">The PageRank scores can be calculated by running the PageRank algorithm for </w:t>
+            </w:r>
+            <w:proofErr w:type="gramStart"/>
+            <w:r>
+              <w:rPr>
+                <w:sz w:val="28"/>
+                <w:szCs w:val="28"/>
+              </w:rPr>
+              <w:t>a sufficient number of</w:t>
+            </w:r>
+            <w:proofErr w:type="gramEnd"/>
+            <w:r>
+              <w:rPr>
+                <w:sz w:val="28"/>
+                <w:szCs w:val="28"/>
+              </w:rPr>
+              <w:t xml:space="preserve"> iterations until the scores converge.</w:t>
             </w:r>
           </w:p>
           <w:p>
@@ -15377,7 +15801,23 @@
                 <w:sz w:val="28"/>
                 <w:szCs w:val="28"/>
               </w:rPr>
-              <w:t>The PageRank algorithm is based on the principle that important web pages are likely to be linked to by other important web pages. By iteratively distributing rank based on the links between web pages, the algorithm is able to identify the most important pages in the web graph.</w:t>
+              <w:t xml:space="preserve">The PageRank algorithm is based on the principle that important web pages are likely to be linked to by other important web pages. By iteratively distributing rank based on the links between web pages, the algorithm </w:t>
+            </w:r>
+            <w:proofErr w:type="gramStart"/>
+            <w:r>
+              <w:rPr>
+                <w:sz w:val="28"/>
+                <w:szCs w:val="28"/>
+              </w:rPr>
+              <w:t>is able to</w:t>
+            </w:r>
+            <w:proofErr w:type="gramEnd"/>
+            <w:r>
+              <w:rPr>
+                <w:sz w:val="28"/>
+                <w:szCs w:val="28"/>
+              </w:rPr>
+              <w:t xml:space="preserve"> identify the most important pages in the web graph.</w:t>
             </w:r>
           </w:p>
           <w:p>
@@ -15845,7 +16285,23 @@
                 <w:sz w:val="28"/>
                 <w:szCs w:val="28"/>
               </w:rPr>
-              <w:t>In summary, communities can have a significant impact on diffusion in social networks. They can provide a dense and interconnected group of individuals who are more likely to share and spread information within the community, and can also facilitate the spread of information and ideas between different communities. Understanding the impact of communities on diffusion is crucial for understanding the dynamics of social networks and for developing strategies to promote positive diffusion outcomes.</w:t>
+              <w:t xml:space="preserve">In summary, communities can have a significant impact on diffusion in social networks. They can provide a dense and interconnected group of individuals who are more likely to share and spread information within the </w:t>
+            </w:r>
+            <w:proofErr w:type="gramStart"/>
+            <w:r>
+              <w:rPr>
+                <w:sz w:val="28"/>
+                <w:szCs w:val="28"/>
+              </w:rPr>
+              <w:t>community, and</w:t>
+            </w:r>
+            <w:proofErr w:type="gramEnd"/>
+            <w:r>
+              <w:rPr>
+                <w:sz w:val="28"/>
+                <w:szCs w:val="28"/>
+              </w:rPr>
+              <w:t xml:space="preserve"> can also facilitate the spread of information and ideas between different communities. Understanding the impact of communities on diffusion is crucial for understanding the dynamics of social networks and for developing strategies to promote positive diffusion outcomes.</w:t>
             </w:r>
           </w:p>
         </w:tc>
@@ -17296,7 +17752,23 @@
                 <w:sz w:val="28"/>
                 <w:szCs w:val="28"/>
               </w:rPr>
-              <w:t>Foci closure refers to the process of forming ties based on shared social foci, such as shared activities, interests, or experiences. When individuals share a social foci, they are more likely to form ties with each other, leading to the formation of clustered structures in the network. Foci closure is an important mechanism for the formation of cohesive subgroups within a larger network.</w:t>
+              <w:t xml:space="preserve">Foci closure refers to the process of forming ties based on shared social foci, such as shared activities, interests, or experiences. When individuals share a </w:t>
+            </w:r>
+            <w:proofErr w:type="gramStart"/>
+            <w:r>
+              <w:rPr>
+                <w:sz w:val="28"/>
+                <w:szCs w:val="28"/>
+              </w:rPr>
+              <w:t>social foci</w:t>
+            </w:r>
+            <w:proofErr w:type="gramEnd"/>
+            <w:r>
+              <w:rPr>
+                <w:sz w:val="28"/>
+                <w:szCs w:val="28"/>
+              </w:rPr>
+              <w:t>, they are more likely to form ties with each other, leading to the formation of clustered structures in the network. Foci closure is an important mechanism for the formation of cohesive subgroups within a larger network.</w:t>
             </w:r>
           </w:p>
           <w:p>
@@ -17654,7 +18126,23 @@
                 <w:sz w:val="28"/>
                 <w:szCs w:val="28"/>
               </w:rPr>
-              <w:t xml:space="preserve"> W. Dijkstra, who introduced it in 1956. It is a simple and efficient algorithm that has a time complexity of O(|E| + |V| log |V|), where |E| is the number of edges and |V| is the number of vertices in the graph. This makes it a practical algorithm for large graphs, and it has been widely implemented in various programming languages and libraries.</w:t>
+              <w:t xml:space="preserve"> W. Dijkstra, who introduced it in 1956. It is a simple and efficient algorithm that has a time complexity of </w:t>
+            </w:r>
+            <w:proofErr w:type="gramStart"/>
+            <w:r>
+              <w:rPr>
+                <w:sz w:val="28"/>
+                <w:szCs w:val="28"/>
+              </w:rPr>
+              <w:t>O(</w:t>
+            </w:r>
+            <w:proofErr w:type="gramEnd"/>
+            <w:r>
+              <w:rPr>
+                <w:sz w:val="28"/>
+                <w:szCs w:val="28"/>
+              </w:rPr>
+              <w:t>|E| + |V| log |V|), where |E| is the number of edges and |V| is the number of vertices in the graph. This makes it a practical algorithm for large graphs, and it has been widely implemented in various programming languages and libraries.</w:t>
             </w:r>
           </w:p>
           <w:p>
@@ -18008,7 +18496,23 @@
                 <w:sz w:val="28"/>
                 <w:szCs w:val="28"/>
               </w:rPr>
-              <w:t>To illustrate this point, consider the example of the words "love" and "hate" in English. Although these words are not synonyms in the strict sense, it is possible to traverse a synonymy network from "love" to "hate" by following a series of synonymous relationships. For example, "love" might be synonymous with "affection," which might be synonymous with "liking," which might be synonymous with "dislike," which might be synonymous with "hatred," which might be synonymous with "hate." This example demonstrates the surprising and sometimes counterintuitive nature of synonymy networks, and highlights the value of network analysis in understanding the structure of natural language.</w:t>
+              <w:t xml:space="preserve">To illustrate this point, consider the example of the words "love" and "hate" in English. Although these words are not synonyms in the strict sense, it is possible to traverse a synonymy network from "love" to "hate" by following a series of synonymous relationships. For example, "love" might be synonymous with "affection," which might be synonymous with "liking," which might be synonymous with "dislike," which might be synonymous with "hatred," which might be synonymous with "hate." This example demonstrates the surprising and sometimes counterintuitive nature of synonymy </w:t>
+            </w:r>
+            <w:proofErr w:type="gramStart"/>
+            <w:r>
+              <w:rPr>
+                <w:sz w:val="28"/>
+                <w:szCs w:val="28"/>
+              </w:rPr>
+              <w:t>networks, and</w:t>
+            </w:r>
+            <w:proofErr w:type="gramEnd"/>
+            <w:r>
+              <w:rPr>
+                <w:sz w:val="28"/>
+                <w:szCs w:val="28"/>
+              </w:rPr>
+              <w:t xml:space="preserve"> highlights the value of network analysis in understanding the structure of natural language.</w:t>
             </w:r>
           </w:p>
           <w:p>
@@ -18264,7 +18768,7 @@
                 <w:sz w:val="28"/>
                 <w:szCs w:val="28"/>
               </w:rPr>
-              <w:t>A synonymy network is a type of network that represents the relationships between words or concepts that have similar meanings or are interchangeable in certain contexts. In a synonymy network, nodes represent words or concepts, and edges represent the relationships between them. Specifically, an edge between two nodes indicates that the corresponding words or concepts are synonyms.</w:t>
+              <w:t>Graph partitioning is the process of dividing a graph into multiple parts or subgraphs, such that each subgraph has a high density of edges within it and a low density of edges between subgraphs. This technique is widely used in various fields, including social network analysis, computer science, and mathematics.</w:t>
             </w:r>
           </w:p>
           <w:p>
@@ -18291,7 +18795,7 @@
                 <w:sz w:val="28"/>
                 <w:szCs w:val="28"/>
               </w:rPr>
-              <w:t>Synonymy networks can be used to analyze the structure of natural language and to identify the relationships between words and concepts. For example, by analyzing a synonymy network, it is possible to identify clusters of related words or concepts, to identify central or influential words or concepts, and to identify paths between words or concepts that might not be immediately apparent from a simple list of synonyms.</w:t>
+              <w:t>In social network analysis, graph partitioning can be used to identify communities or groups of individuals who are closely connected to each other. For example, in a social network of people who share common interests, graph partitioning can be used to identify groups of people who are more likely to communicate or collaborate with each other.</w:t>
             </w:r>
           </w:p>
           <w:p>
@@ -18318,7 +18822,7 @@
                 <w:sz w:val="28"/>
                 <w:szCs w:val="28"/>
               </w:rPr>
-              <w:t>One interesting property of synonymy networks is that they are often connected, meaning that it is possible to traverse the network from any word or concept to any other word or concept by following a series of synonymous relationships. This property can be surprising, as it suggests that there is a deep structure to natural language that goes beyond simple word-level relationships.</w:t>
+              <w:t>There are several algorithms for graph partitioning, including the Kernighan-Lin algorithm, the Fiedler vector method, and the spectral clustering method. These algorithms use different techniques to partition the graph, such as optimizing the number of edges between subgraphs, minimizing the number of vertices in each subgraph, and maximizing the modularity of the partition.</w:t>
             </w:r>
           </w:p>
           <w:p>
@@ -18345,7 +18849,7 @@
                 <w:sz w:val="28"/>
                 <w:szCs w:val="28"/>
               </w:rPr>
-              <w:t>To illustrate this point, consider the example of the words "love" and "hate" in English. Although these words are not synonyms in the strict sense, it is possible to traverse a synonymy network from "love" to "hate" by following a series of synonymous relationships. For example, "love" might be synonymous with "affection," which might be synonymous with "liking," which might be synonymous with "dislike," which might be synonymous with "hatred," which might be synonymous with "hate." This example demonstrates the surprising and sometimes counterintuitive nature of synonymy networks, and highlights the value of network analysis in understanding the structure of natural language.</w:t>
+              <w:t>The Kernighan-Lin algorithm is a heuristic algorithm that uses a series of vertex swaps to partition the graph. It starts with an initial partition and then iteratively swaps vertices between subgraphs to improve the partition.</w:t>
             </w:r>
           </w:p>
           <w:p>
@@ -18372,7 +18876,61 @@
                 <w:sz w:val="28"/>
                 <w:szCs w:val="28"/>
               </w:rPr>
-              <w:t>In summary, a synonymy network is a type of network that represents the relationships between words or concepts that have similar meanings or are interchangeable in certain contexts. Synonymy networks can be used to analyze the structure of natural language and to identify the relationships between words and concepts. They often have surprising properties, such as being connected, which can shed light on the deep structure of natural language.</w:t>
+              <w:t>The Fiedler vector method is a spectral graph theory method that uses the eigenvectors of the Laplacian matrix of the graph to partition the graph. The Laplacian matrix is a matrix that represents the connectivity of the graph, and its eigenvectors can be used to identify the underlying structure of the graph.</w:t>
+            </w:r>
+          </w:p>
+          <w:p>
+            <w:pPr>
+              <w:pStyle w:val="TableParagraph"/>
+              <w:spacing w:before="69"/>
+              <w:rPr>
+                <w:sz w:val="28"/>
+                <w:szCs w:val="28"/>
+              </w:rPr>
+            </w:pPr>
+          </w:p>
+          <w:p>
+            <w:pPr>
+              <w:pStyle w:val="TableParagraph"/>
+              <w:spacing w:before="69"/>
+              <w:rPr>
+                <w:sz w:val="28"/>
+                <w:szCs w:val="28"/>
+              </w:rPr>
+            </w:pPr>
+            <w:r>
+              <w:rPr>
+                <w:sz w:val="28"/>
+                <w:szCs w:val="28"/>
+              </w:rPr>
+              <w:t>The spectral clustering method is a machine learning method that uses the eigenvectors of the Laplacian matrix to partition the graph. It first computes the eigenvectors of the Laplacian matrix and then uses these eigenvectors to cluster the vertices into subgraphs.</w:t>
+            </w:r>
+          </w:p>
+          <w:p>
+            <w:pPr>
+              <w:pStyle w:val="TableParagraph"/>
+              <w:spacing w:before="69"/>
+              <w:rPr>
+                <w:sz w:val="28"/>
+                <w:szCs w:val="28"/>
+              </w:rPr>
+            </w:pPr>
+          </w:p>
+          <w:p>
+            <w:pPr>
+              <w:pStyle w:val="TableParagraph"/>
+              <w:spacing w:before="69"/>
+              <w:rPr>
+                <w:sz w:val="28"/>
+                <w:szCs w:val="28"/>
+              </w:rPr>
+            </w:pPr>
+            <w:r>
+              <w:rPr>
+                <w:sz w:val="28"/>
+                <w:szCs w:val="28"/>
+              </w:rPr>
+              <w:t>In summary, graph partitioning is a powerful technique for analyzing complex networks, including social networks. By dividing a graph into subgraphs, it is possible to identify communities, clusters, and other structures that are hidden in the network. The Kernighan-Lin algorithm, the Fiedler vector method, and the spectral clustering method are some of the popular algorithms for graph partitioning.</w:t>
             </w:r>
           </w:p>
         </w:tc>
@@ -18380,7 +18938,7 @@
     </w:tbl>
     <w:p/>
     <w:sectPr>
-      <w:pgSz w:w="11913" w:h="13041"/>
+      <w:pgSz w:w="11913" w:h="14175"/>
       <w:pgMar w:top="0" w:right="1480" w:bottom="0" w:left="697" w:header="720" w:footer="720" w:gutter="0"/>
       <w:cols w:space="720"/>
     </w:sectPr>
@@ -19728,6 +20286,7 @@
   <w:style w:type="character" w:default="1" w:styleId="DefaultParagraphFont">
     <w:name w:val="Default Paragraph Font"/>
     <w:uiPriority w:val="1"/>
+    <w:semiHidden/>
     <w:unhideWhenUsed/>
   </w:style>
   <w:style w:type="table" w:default="1" w:styleId="TableNormal">

</xml_diff>